<commit_message>
Resumos: layout contínuo sem lacunas e versão preto e branco para impressão
Co-Authored-By: Claude Sonnet 5.5 <noreply@anthropic.com>
Claude-Session: https://claude.ai/code/session_01Do9hqtSk4H2ftCxWFi8D78
</commit_message>
<xml_diff>
--- a/resumos/Blocos_2_a_11_CONSUNI_CEPE_CAD_REITORIA_CAMPUS_CENTROS_COLEGIADOS_ATIVIDADES_COMUNIDADE_DISCIPLINAR.docx
+++ b/resumos/Blocos_2_a_11_CONSUNI_CEPE_CAD_REITORIA_CAMPUS_CENTROS_COLEGIADOS_ATIVIDADES_COMUNIDADE_DISCIPLINAR.docx
@@ -4,6 +4,7 @@
   <w:body>
     <w:p>
       <w:pPr>
+        <w:keepNext/>
         <w:spacing w:after="20" w:before="0"/>
         <w:jc w:val="center"/>
       </w:pPr>
@@ -18,6 +19,7 @@
     </w:p>
     <w:p>
       <w:pPr>
+        <w:keepNext/>
         <w:spacing w:after="60" w:before="0"/>
         <w:jc w:val="center"/>
       </w:pPr>
@@ -51,12 +53,12 @@
               <w:bottom w:w="65" w:type="dxa"/>
               <w:end w:w="80" w:type="dxa"/>
             </w:tcMar>
-            <w:shd w:fill="EAF2F8"/>
+            <w:shd w:fill="F2F2F2"/>
             <w:tcBorders>
-              <w:top w:val="single" w:sz="5" w:color="9FBAD0"/>
-              <w:left w:val="single" w:sz="5" w:color="9FBAD0"/>
-              <w:bottom w:val="single" w:sz="5" w:color="9FBAD0"/>
-              <w:right w:val="single" w:sz="5" w:color="9FBAD0"/>
+              <w:top w:val="single" w:sz="5" w:color="000000"/>
+              <w:left w:val="single" w:sz="5" w:color="000000"/>
+              <w:bottom w:val="single" w:sz="5" w:color="000000"/>
+              <w:right w:val="single" w:sz="5" w:color="000000"/>
             </w:tcBorders>
           </w:tcPr>
           <w:p>
@@ -106,12 +108,12 @@
               <w:bottom w:w="65" w:type="dxa"/>
               <w:end w:w="80" w:type="dxa"/>
             </w:tcMar>
-            <w:shd w:fill="EAF2F8"/>
+            <w:shd w:fill="F2F2F2"/>
             <w:tcBorders>
-              <w:top w:val="single" w:sz="5" w:color="9FBAD0"/>
-              <w:left w:val="single" w:sz="5" w:color="9FBAD0"/>
-              <w:bottom w:val="single" w:sz="5" w:color="9FBAD0"/>
-              <w:right w:val="single" w:sz="5" w:color="9FBAD0"/>
+              <w:top w:val="single" w:sz="5" w:color="000000"/>
+              <w:left w:val="single" w:sz="5" w:color="000000"/>
+              <w:bottom w:val="single" w:sz="5" w:color="000000"/>
+              <w:right w:val="single" w:sz="5" w:color="000000"/>
             </w:tcBorders>
           </w:tcPr>
           <w:p>
@@ -165,10 +167,10 @@
               <w:end w:w="75" w:type="dxa"/>
             </w:tcMar>
             <w:tcBorders>
-              <w:top w:val="single" w:sz="4" w:color="BFBFBF"/>
-              <w:left w:val="single" w:sz="4" w:color="BFBFBF"/>
-              <w:bottom w:val="single" w:sz="4" w:color="BFBFBF"/>
-              <w:right w:val="single" w:sz="4" w:color="BFBFBF"/>
+              <w:top w:val="single" w:sz="4" w:color="808080"/>
+              <w:left w:val="single" w:sz="4" w:color="808080"/>
+              <w:bottom w:val="single" w:sz="4" w:color="808080"/>
+              <w:right w:val="single" w:sz="4" w:color="808080"/>
             </w:tcBorders>
           </w:tcPr>
           <w:p>
@@ -261,10 +263,10 @@
               <w:end w:w="75" w:type="dxa"/>
             </w:tcMar>
             <w:tcBorders>
-              <w:top w:val="single" w:sz="4" w:color="BFBFBF"/>
-              <w:left w:val="single" w:sz="4" w:color="BFBFBF"/>
-              <w:bottom w:val="single" w:sz="4" w:color="BFBFBF"/>
-              <w:right w:val="single" w:sz="4" w:color="BFBFBF"/>
+              <w:top w:val="single" w:sz="4" w:color="808080"/>
+              <w:left w:val="single" w:sz="4" w:color="808080"/>
+              <w:bottom w:val="single" w:sz="4" w:color="808080"/>
+              <w:right w:val="single" w:sz="4" w:color="808080"/>
             </w:tcBorders>
           </w:tcPr>
           <w:p>
@@ -406,12 +408,12 @@
               <w:bottom w:w="60" w:type="dxa"/>
               <w:end w:w="80" w:type="dxa"/>
             </w:tcMar>
-            <w:shd w:fill="F7F7F7"/>
+            <w:shd w:fill="FFFFFF"/>
             <w:tcBorders>
-              <w:top w:val="single" w:sz="4" w:color="BFBFBF"/>
-              <w:left w:val="single" w:sz="4" w:color="BFBFBF"/>
-              <w:bottom w:val="single" w:sz="4" w:color="BFBFBF"/>
-              <w:right w:val="single" w:sz="4" w:color="BFBFBF"/>
+              <w:top w:val="single" w:sz="4" w:color="808080"/>
+              <w:left w:val="single" w:sz="4" w:color="808080"/>
+              <w:bottom w:val="single" w:sz="4" w:color="808080"/>
+              <w:right w:val="single" w:sz="4" w:color="808080"/>
             </w:tcBorders>
           </w:tcPr>
           <w:p>
@@ -736,12 +738,12 @@
               <w:bottom w:w="60" w:type="dxa"/>
               <w:end w:w="70" w:type="dxa"/>
             </w:tcMar>
-            <w:shd w:fill="EAF2F8"/>
+            <w:shd w:fill="F2F2F2"/>
             <w:tcBorders>
-              <w:top w:val="single" w:sz="5" w:color="A6A6A6"/>
-              <w:left w:val="single" w:sz="5" w:color="A6A6A6"/>
-              <w:bottom w:val="single" w:sz="5" w:color="A6A6A6"/>
-              <w:right w:val="single" w:sz="5" w:color="A6A6A6"/>
+              <w:top w:val="single" w:sz="5" w:color="808080"/>
+              <w:left w:val="single" w:sz="5" w:color="808080"/>
+              <w:bottom w:val="single" w:sz="5" w:color="808080"/>
+              <w:right w:val="single" w:sz="5" w:color="808080"/>
             </w:tcBorders>
           </w:tcPr>
           <w:p>
@@ -779,12 +781,12 @@
               <w:bottom w:w="60" w:type="dxa"/>
               <w:end w:w="70" w:type="dxa"/>
             </w:tcMar>
-            <w:shd w:fill="FCE4D6"/>
+            <w:shd w:fill="E3E3E3"/>
             <w:tcBorders>
-              <w:top w:val="single" w:sz="5" w:color="A6A6A6"/>
-              <w:left w:val="single" w:sz="5" w:color="A6A6A6"/>
-              <w:bottom w:val="single" w:sz="5" w:color="A6A6A6"/>
-              <w:right w:val="single" w:sz="5" w:color="A6A6A6"/>
+              <w:top w:val="single" w:sz="5" w:color="808080"/>
+              <w:left w:val="single" w:sz="5" w:color="808080"/>
+              <w:bottom w:val="single" w:sz="5" w:color="808080"/>
+              <w:right w:val="single" w:sz="5" w:color="808080"/>
             </w:tcBorders>
           </w:tcPr>
           <w:p>
@@ -822,12 +824,12 @@
               <w:bottom w:w="60" w:type="dxa"/>
               <w:end w:w="70" w:type="dxa"/>
             </w:tcMar>
-            <w:shd w:fill="FFF2CC"/>
+            <w:shd w:fill="E3E3E3"/>
             <w:tcBorders>
-              <w:top w:val="single" w:sz="5" w:color="A6A6A6"/>
-              <w:left w:val="single" w:sz="5" w:color="A6A6A6"/>
-              <w:bottom w:val="single" w:sz="5" w:color="A6A6A6"/>
-              <w:right w:val="single" w:sz="5" w:color="A6A6A6"/>
+              <w:top w:val="single" w:sz="5" w:color="808080"/>
+              <w:left w:val="single" w:sz="5" w:color="808080"/>
+              <w:bottom w:val="single" w:sz="5" w:color="808080"/>
+              <w:right w:val="single" w:sz="5" w:color="808080"/>
             </w:tcBorders>
           </w:tcPr>
           <w:p>
@@ -899,10 +901,10 @@
               <w:end w:w="75" w:type="dxa"/>
             </w:tcMar>
             <w:tcBorders>
-              <w:top w:val="single" w:sz="4" w:color="BFBFBF"/>
-              <w:left w:val="single" w:sz="4" w:color="BFBFBF"/>
-              <w:bottom w:val="single" w:sz="4" w:color="BFBFBF"/>
-              <w:right w:val="single" w:sz="4" w:color="BFBFBF"/>
+              <w:top w:val="single" w:sz="4" w:color="808080"/>
+              <w:left w:val="single" w:sz="4" w:color="808080"/>
+              <w:bottom w:val="single" w:sz="4" w:color="808080"/>
+              <w:right w:val="single" w:sz="4" w:color="808080"/>
             </w:tcBorders>
           </w:tcPr>
           <w:p>
@@ -1001,10 +1003,10 @@
               <w:end w:w="75" w:type="dxa"/>
             </w:tcMar>
             <w:tcBorders>
-              <w:top w:val="single" w:sz="4" w:color="BFBFBF"/>
-              <w:left w:val="single" w:sz="4" w:color="BFBFBF"/>
-              <w:bottom w:val="single" w:sz="4" w:color="BFBFBF"/>
-              <w:right w:val="single" w:sz="4" w:color="BFBFBF"/>
+              <w:top w:val="single" w:sz="4" w:color="808080"/>
+              <w:left w:val="single" w:sz="4" w:color="808080"/>
+              <w:bottom w:val="single" w:sz="4" w:color="808080"/>
+              <w:right w:val="single" w:sz="4" w:color="808080"/>
             </w:tcBorders>
           </w:tcPr>
           <w:p>
@@ -1079,12 +1081,12 @@
               <w:bottom w:w="65" w:type="dxa"/>
               <w:end w:w="85" w:type="dxa"/>
             </w:tcMar>
-            <w:shd w:fill="E2F0D9"/>
+            <w:shd w:fill="D0D0D0"/>
             <w:tcBorders>
-              <w:top w:val="single" w:sz="6" w:color="70AD47"/>
-              <w:left w:val="single" w:sz="6" w:color="70AD47"/>
-              <w:bottom w:val="single" w:sz="6" w:color="70AD47"/>
-              <w:right w:val="single" w:sz="6" w:color="70AD47"/>
+              <w:top w:val="single" w:sz="6" w:color="000000"/>
+              <w:left w:val="single" w:sz="6" w:color="000000"/>
+              <w:bottom w:val="single" w:sz="6" w:color="000000"/>
+              <w:right w:val="single" w:sz="6" w:color="000000"/>
             </w:tcBorders>
           </w:tcPr>
           <w:p>
@@ -1118,6 +1120,7 @@
     </w:tbl>
     <w:p>
       <w:pPr>
+        <w:keepNext/>
         <w:spacing w:after="20"/>
         <w:jc w:val="center"/>
       </w:pPr>
@@ -1132,6 +1135,7 @@
     </w:p>
     <w:p>
       <w:pPr>
+        <w:keepNext/>
         <w:spacing w:after="60"/>
         <w:jc w:val="center"/>
       </w:pPr>
@@ -1166,12 +1170,12 @@
               <w:end w:w="70" w:type="dxa"/>
             </w:tcMar>
             <w:tcBorders>
-              <w:top w:val="single" w:sz="4" w:color="BFBFBF"/>
-              <w:bottom w:val="single" w:sz="4" w:color="BFBFBF"/>
-              <w:left w:val="single" w:sz="4" w:color="BFBFBF"/>
-              <w:right w:val="single" w:sz="4" w:color="BFBFBF"/>
+              <w:top w:val="single" w:sz="4" w:color="808080"/>
+              <w:bottom w:val="single" w:sz="4" w:color="808080"/>
+              <w:left w:val="single" w:sz="4" w:color="808080"/>
+              <w:right w:val="single" w:sz="4" w:color="808080"/>
             </w:tcBorders>
-            <w:shd w:fill="EAF2F8"/>
+            <w:shd w:fill="F2F2F2"/>
           </w:tcPr>
           <w:p>
             <w:pPr>
@@ -1239,12 +1243,12 @@
               <w:end w:w="70" w:type="dxa"/>
             </w:tcMar>
             <w:tcBorders>
-              <w:top w:val="single" w:sz="4" w:color="BFBFBF"/>
-              <w:bottom w:val="single" w:sz="4" w:color="BFBFBF"/>
-              <w:left w:val="single" w:sz="4" w:color="BFBFBF"/>
-              <w:right w:val="single" w:sz="4" w:color="BFBFBF"/>
+              <w:top w:val="single" w:sz="4" w:color="808080"/>
+              <w:bottom w:val="single" w:sz="4" w:color="808080"/>
+              <w:left w:val="single" w:sz="4" w:color="808080"/>
+              <w:right w:val="single" w:sz="4" w:color="808080"/>
             </w:tcBorders>
-            <w:shd w:fill="EAF2F8"/>
+            <w:shd w:fill="F2F2F2"/>
           </w:tcPr>
           <w:p>
             <w:pPr>
@@ -1347,10 +1351,10 @@
               <w:end w:w="70" w:type="dxa"/>
             </w:tcMar>
             <w:tcBorders>
-              <w:top w:val="single" w:sz="4" w:color="BFBFBF"/>
-              <w:bottom w:val="single" w:sz="4" w:color="BFBFBF"/>
-              <w:left w:val="single" w:sz="4" w:color="BFBFBF"/>
-              <w:right w:val="single" w:sz="4" w:color="BFBFBF"/>
+              <w:top w:val="single" w:sz="4" w:color="808080"/>
+              <w:bottom w:val="single" w:sz="4" w:color="808080"/>
+              <w:left w:val="single" w:sz="4" w:color="808080"/>
+              <w:right w:val="single" w:sz="4" w:color="808080"/>
             </w:tcBorders>
           </w:tcPr>
           <w:p>
@@ -1419,10 +1423,10 @@
               <w:end w:w="70" w:type="dxa"/>
             </w:tcMar>
             <w:tcBorders>
-              <w:top w:val="single" w:sz="4" w:color="BFBFBF"/>
-              <w:bottom w:val="single" w:sz="4" w:color="BFBFBF"/>
-              <w:left w:val="single" w:sz="4" w:color="BFBFBF"/>
-              <w:right w:val="single" w:sz="4" w:color="BFBFBF"/>
+              <w:top w:val="single" w:sz="4" w:color="808080"/>
+              <w:bottom w:val="single" w:sz="4" w:color="808080"/>
+              <w:left w:val="single" w:sz="4" w:color="808080"/>
+              <w:right w:val="single" w:sz="4" w:color="808080"/>
             </w:tcBorders>
           </w:tcPr>
           <w:p>
@@ -1569,12 +1573,12 @@
               <w:end w:w="65" w:type="dxa"/>
             </w:tcMar>
             <w:tcBorders>
-              <w:top w:val="single" w:sz="4" w:color="BFBFBF"/>
-              <w:bottom w:val="single" w:sz="4" w:color="BFBFBF"/>
-              <w:left w:val="single" w:sz="4" w:color="BFBFBF"/>
-              <w:right w:val="single" w:sz="4" w:color="BFBFBF"/>
+              <w:top w:val="single" w:sz="4" w:color="808080"/>
+              <w:bottom w:val="single" w:sz="4" w:color="808080"/>
+              <w:left w:val="single" w:sz="4" w:color="808080"/>
+              <w:right w:val="single" w:sz="4" w:color="808080"/>
             </w:tcBorders>
-            <w:shd w:fill="F7F7F7"/>
+            <w:shd w:fill="FFFFFF"/>
           </w:tcPr>
           <w:p>
             <w:pPr>
@@ -1633,12 +1637,12 @@
               <w:end w:w="65" w:type="dxa"/>
             </w:tcMar>
             <w:tcBorders>
-              <w:top w:val="single" w:sz="4" w:color="BFBFBF"/>
-              <w:bottom w:val="single" w:sz="4" w:color="BFBFBF"/>
-              <w:left w:val="single" w:sz="4" w:color="BFBFBF"/>
-              <w:right w:val="single" w:sz="4" w:color="BFBFBF"/>
+              <w:top w:val="single" w:sz="4" w:color="808080"/>
+              <w:bottom w:val="single" w:sz="4" w:color="808080"/>
+              <w:left w:val="single" w:sz="4" w:color="808080"/>
+              <w:right w:val="single" w:sz="4" w:color="808080"/>
             </w:tcBorders>
-            <w:shd w:fill="F7F7F7"/>
+            <w:shd w:fill="FFFFFF"/>
           </w:tcPr>
           <w:p>
             <w:pPr>
@@ -1697,12 +1701,12 @@
               <w:end w:w="65" w:type="dxa"/>
             </w:tcMar>
             <w:tcBorders>
-              <w:top w:val="single" w:sz="4" w:color="BFBFBF"/>
-              <w:bottom w:val="single" w:sz="4" w:color="BFBFBF"/>
-              <w:left w:val="single" w:sz="4" w:color="BFBFBF"/>
-              <w:right w:val="single" w:sz="4" w:color="BFBFBF"/>
+              <w:top w:val="single" w:sz="4" w:color="808080"/>
+              <w:bottom w:val="single" w:sz="4" w:color="808080"/>
+              <w:left w:val="single" w:sz="4" w:color="808080"/>
+              <w:right w:val="single" w:sz="4" w:color="808080"/>
             </w:tcBorders>
-            <w:shd w:fill="F7F7F7"/>
+            <w:shd w:fill="FFFFFF"/>
           </w:tcPr>
           <w:p>
             <w:pPr>
@@ -1774,10 +1778,10 @@
               <w:end w:w="75" w:type="dxa"/>
             </w:tcMar>
             <w:tcBorders>
-              <w:top w:val="single" w:sz="4" w:color="BFBFBF"/>
-              <w:bottom w:val="single" w:sz="4" w:color="BFBFBF"/>
-              <w:left w:val="single" w:sz="4" w:color="BFBFBF"/>
-              <w:right w:val="single" w:sz="4" w:color="BFBFBF"/>
+              <w:top w:val="single" w:sz="4" w:color="808080"/>
+              <w:bottom w:val="single" w:sz="4" w:color="808080"/>
+              <w:left w:val="single" w:sz="4" w:color="808080"/>
+              <w:right w:val="single" w:sz="4" w:color="808080"/>
             </w:tcBorders>
             <w:shd w:fill="F2F2F2"/>
           </w:tcPr>
@@ -2182,10 +2186,10 @@
               <w:end w:w="70" w:type="dxa"/>
             </w:tcMar>
             <w:tcBorders>
-              <w:top w:val="single" w:sz="4" w:color="BFBFBF"/>
-              <w:bottom w:val="single" w:sz="4" w:color="BFBFBF"/>
-              <w:left w:val="single" w:sz="4" w:color="BFBFBF"/>
-              <w:right w:val="single" w:sz="4" w:color="BFBFBF"/>
+              <w:top w:val="single" w:sz="4" w:color="808080"/>
+              <w:bottom w:val="single" w:sz="4" w:color="808080"/>
+              <w:left w:val="single" w:sz="4" w:color="808080"/>
+              <w:right w:val="single" w:sz="4" w:color="808080"/>
             </w:tcBorders>
           </w:tcPr>
           <w:p>
@@ -2330,10 +2334,10 @@
               <w:end w:w="70" w:type="dxa"/>
             </w:tcMar>
             <w:tcBorders>
-              <w:top w:val="single" w:sz="4" w:color="BFBFBF"/>
-              <w:bottom w:val="single" w:sz="4" w:color="BFBFBF"/>
-              <w:left w:val="single" w:sz="4" w:color="BFBFBF"/>
-              <w:right w:val="single" w:sz="4" w:color="BFBFBF"/>
+              <w:top w:val="single" w:sz="4" w:color="808080"/>
+              <w:bottom w:val="single" w:sz="4" w:color="808080"/>
+              <w:left w:val="single" w:sz="4" w:color="808080"/>
+              <w:right w:val="single" w:sz="4" w:color="808080"/>
             </w:tcBorders>
           </w:tcPr>
           <w:p>
@@ -2412,12 +2416,12 @@
               <w:end w:w="80" w:type="dxa"/>
             </w:tcMar>
             <w:tcBorders>
-              <w:top w:val="single" w:sz="6" w:color="70AD47"/>
-              <w:bottom w:val="single" w:sz="6" w:color="70AD47"/>
-              <w:left w:val="single" w:sz="6" w:color="70AD47"/>
-              <w:right w:val="single" w:sz="6" w:color="70AD47"/>
+              <w:top w:val="single" w:sz="6" w:color="000000"/>
+              <w:bottom w:val="single" w:sz="6" w:color="000000"/>
+              <w:left w:val="single" w:sz="6" w:color="000000"/>
+              <w:right w:val="single" w:sz="6" w:color="000000"/>
             </w:tcBorders>
-            <w:shd w:fill="E2F0D9"/>
+            <w:shd w:fill="D0D0D0"/>
           </w:tcPr>
           <w:p>
             <w:pPr>
@@ -2449,12 +2453,11 @@
       </w:tr>
     </w:tbl>
     <w:p>
-      <w:r>
-        <w:br w:type="page"/>
-      </w:r>
+      <w:r/>
     </w:p>
     <w:p>
       <w:pPr>
+        <w:keepNext/>
         <w:spacing w:after="20"/>
         <w:jc w:val="center"/>
       </w:pPr>
@@ -2469,6 +2472,7 @@
     </w:p>
     <w:p>
       <w:pPr>
+        <w:keepNext/>
         <w:spacing w:after="60"/>
         <w:jc w:val="center"/>
       </w:pPr>
@@ -2503,12 +2507,12 @@
               <w:end w:w="65" w:type="dxa"/>
             </w:tcMar>
             <w:tcBorders>
-              <w:top w:val="single" w:sz="4" w:color="BFBFBF"/>
-              <w:bottom w:val="single" w:sz="4" w:color="BFBFBF"/>
-              <w:left w:val="single" w:sz="4" w:color="BFBFBF"/>
-              <w:right w:val="single" w:sz="4" w:color="BFBFBF"/>
+              <w:top w:val="single" w:sz="4" w:color="808080"/>
+              <w:bottom w:val="single" w:sz="4" w:color="808080"/>
+              <w:left w:val="single" w:sz="4" w:color="808080"/>
+              <w:right w:val="single" w:sz="4" w:color="808080"/>
             </w:tcBorders>
-            <w:shd w:fill="EAF2F8"/>
+            <w:shd w:fill="F2F2F2"/>
           </w:tcPr>
           <w:p>
             <w:pPr>
@@ -2576,10 +2580,10 @@
               <w:end w:w="65" w:type="dxa"/>
             </w:tcMar>
             <w:tcBorders>
-              <w:top w:val="single" w:sz="4" w:color="BFBFBF"/>
-              <w:bottom w:val="single" w:sz="4" w:color="BFBFBF"/>
-              <w:left w:val="single" w:sz="4" w:color="BFBFBF"/>
-              <w:right w:val="single" w:sz="4" w:color="BFBFBF"/>
+              <w:top w:val="single" w:sz="4" w:color="808080"/>
+              <w:bottom w:val="single" w:sz="4" w:color="808080"/>
+              <w:left w:val="single" w:sz="4" w:color="808080"/>
+              <w:right w:val="single" w:sz="4" w:color="808080"/>
             </w:tcBorders>
             <w:shd w:fill="F2F2F2"/>
           </w:tcPr>
@@ -2684,10 +2688,10 @@
               <w:end w:w="65" w:type="dxa"/>
             </w:tcMar>
             <w:tcBorders>
-              <w:top w:val="single" w:sz="4" w:color="BFBFBF"/>
-              <w:bottom w:val="single" w:sz="4" w:color="BFBFBF"/>
-              <w:left w:val="single" w:sz="4" w:color="BFBFBF"/>
-              <w:right w:val="single" w:sz="4" w:color="BFBFBF"/>
+              <w:top w:val="single" w:sz="4" w:color="808080"/>
+              <w:bottom w:val="single" w:sz="4" w:color="808080"/>
+              <w:left w:val="single" w:sz="4" w:color="808080"/>
+              <w:right w:val="single" w:sz="4" w:color="808080"/>
             </w:tcBorders>
           </w:tcPr>
           <w:p>
@@ -2790,10 +2794,10 @@
               <w:end w:w="65" w:type="dxa"/>
             </w:tcMar>
             <w:tcBorders>
-              <w:top w:val="single" w:sz="4" w:color="BFBFBF"/>
-              <w:bottom w:val="single" w:sz="4" w:color="BFBFBF"/>
-              <w:left w:val="single" w:sz="4" w:color="BFBFBF"/>
-              <w:right w:val="single" w:sz="4" w:color="BFBFBF"/>
+              <w:top w:val="single" w:sz="4" w:color="808080"/>
+              <w:bottom w:val="single" w:sz="4" w:color="808080"/>
+              <w:left w:val="single" w:sz="4" w:color="808080"/>
+              <w:right w:val="single" w:sz="4" w:color="808080"/>
             </w:tcBorders>
           </w:tcPr>
           <w:p>
@@ -2917,12 +2921,12 @@
               <w:end w:w="75" w:type="dxa"/>
             </w:tcMar>
             <w:tcBorders>
-              <w:top w:val="single" w:sz="5" w:color="C9B458"/>
-              <w:bottom w:val="single" w:sz="5" w:color="C9B458"/>
-              <w:left w:val="single" w:sz="5" w:color="C9B458"/>
-              <w:right w:val="single" w:sz="5" w:color="C9B458"/>
+              <w:top w:val="single" w:sz="5" w:color="000000"/>
+              <w:bottom w:val="single" w:sz="5" w:color="000000"/>
+              <w:left w:val="single" w:sz="5" w:color="000000"/>
+              <w:right w:val="single" w:sz="5" w:color="000000"/>
             </w:tcBorders>
-            <w:shd w:fill="FFF2CC"/>
+            <w:shd w:fill="E3E3E3"/>
           </w:tcPr>
           <w:p>
             <w:pPr>
@@ -2988,12 +2992,12 @@
               <w:end w:w="70" w:type="dxa"/>
             </w:tcMar>
             <w:tcBorders>
-              <w:top w:val="single" w:sz="4" w:color="BFBFBF"/>
-              <w:bottom w:val="single" w:sz="4" w:color="BFBFBF"/>
-              <w:left w:val="single" w:sz="4" w:color="BFBFBF"/>
-              <w:right w:val="single" w:sz="4" w:color="BFBFBF"/>
+              <w:top w:val="single" w:sz="4" w:color="808080"/>
+              <w:bottom w:val="single" w:sz="4" w:color="808080"/>
+              <w:left w:val="single" w:sz="4" w:color="808080"/>
+              <w:right w:val="single" w:sz="4" w:color="808080"/>
             </w:tcBorders>
-            <w:shd w:fill="F7F7F7"/>
+            <w:shd w:fill="FFFFFF"/>
           </w:tcPr>
           <w:p>
             <w:pPr>
@@ -3045,12 +3049,12 @@
               <w:end w:w="70" w:type="dxa"/>
             </w:tcMar>
             <w:tcBorders>
-              <w:top w:val="single" w:sz="4" w:color="BFBFBF"/>
-              <w:bottom w:val="single" w:sz="4" w:color="BFBFBF"/>
-              <w:left w:val="single" w:sz="4" w:color="BFBFBF"/>
-              <w:right w:val="single" w:sz="4" w:color="BFBFBF"/>
+              <w:top w:val="single" w:sz="4" w:color="808080"/>
+              <w:bottom w:val="single" w:sz="4" w:color="808080"/>
+              <w:left w:val="single" w:sz="4" w:color="808080"/>
+              <w:right w:val="single" w:sz="4" w:color="808080"/>
             </w:tcBorders>
-            <w:shd w:fill="EAF2F8"/>
+            <w:shd w:fill="F2F2F2"/>
           </w:tcPr>
           <w:p>
             <w:pPr>
@@ -3133,12 +3137,12 @@
               <w:end w:w="65" w:type="dxa"/>
             </w:tcMar>
             <w:tcBorders>
-              <w:top w:val="single" w:sz="4" w:color="BFBFBF"/>
-              <w:bottom w:val="single" w:sz="4" w:color="BFBFBF"/>
-              <w:left w:val="single" w:sz="4" w:color="BFBFBF"/>
-              <w:right w:val="single" w:sz="4" w:color="BFBFBF"/>
+              <w:top w:val="single" w:sz="4" w:color="808080"/>
+              <w:bottom w:val="single" w:sz="4" w:color="808080"/>
+              <w:left w:val="single" w:sz="4" w:color="808080"/>
+              <w:right w:val="single" w:sz="4" w:color="808080"/>
             </w:tcBorders>
-            <w:shd w:fill="EAF2F8"/>
+            <w:shd w:fill="F2F2F2"/>
           </w:tcPr>
           <w:p>
             <w:pPr>
@@ -3173,10 +3177,10 @@
               <w:end w:w="65" w:type="dxa"/>
             </w:tcMar>
             <w:tcBorders>
-              <w:top w:val="single" w:sz="4" w:color="BFBFBF"/>
-              <w:bottom w:val="single" w:sz="4" w:color="BFBFBF"/>
-              <w:left w:val="single" w:sz="4" w:color="BFBFBF"/>
-              <w:right w:val="single" w:sz="4" w:color="BFBFBF"/>
+              <w:top w:val="single" w:sz="4" w:color="808080"/>
+              <w:bottom w:val="single" w:sz="4" w:color="808080"/>
+              <w:left w:val="single" w:sz="4" w:color="808080"/>
+              <w:right w:val="single" w:sz="4" w:color="808080"/>
             </w:tcBorders>
             <w:shd w:fill="F2F2F2"/>
           </w:tcPr>
@@ -3213,12 +3217,12 @@
               <w:end w:w="65" w:type="dxa"/>
             </w:tcMar>
             <w:tcBorders>
-              <w:top w:val="single" w:sz="4" w:color="BFBFBF"/>
-              <w:bottom w:val="single" w:sz="4" w:color="BFBFBF"/>
-              <w:left w:val="single" w:sz="4" w:color="BFBFBF"/>
-              <w:right w:val="single" w:sz="4" w:color="BFBFBF"/>
+              <w:top w:val="single" w:sz="4" w:color="808080"/>
+              <w:bottom w:val="single" w:sz="4" w:color="808080"/>
+              <w:left w:val="single" w:sz="4" w:color="808080"/>
+              <w:right w:val="single" w:sz="4" w:color="808080"/>
             </w:tcBorders>
-            <w:shd w:fill="E2F0D9"/>
+            <w:shd w:fill="D0D0D0"/>
           </w:tcPr>
           <w:p>
             <w:pPr>
@@ -3266,12 +3270,12 @@
               <w:end w:w="80" w:type="dxa"/>
             </w:tcMar>
             <w:tcBorders>
-              <w:top w:val="single" w:sz="6" w:color="70AD47"/>
-              <w:bottom w:val="single" w:sz="6" w:color="70AD47"/>
-              <w:left w:val="single" w:sz="6" w:color="70AD47"/>
-              <w:right w:val="single" w:sz="6" w:color="70AD47"/>
+              <w:top w:val="single" w:sz="6" w:color="000000"/>
+              <w:bottom w:val="single" w:sz="6" w:color="000000"/>
+              <w:left w:val="single" w:sz="6" w:color="000000"/>
+              <w:right w:val="single" w:sz="6" w:color="000000"/>
             </w:tcBorders>
-            <w:shd w:fill="E2F0D9"/>
+            <w:shd w:fill="D0D0D0"/>
           </w:tcPr>
           <w:p>
             <w:pPr>
@@ -3304,6 +3308,7 @@
     </w:tbl>
     <w:p>
       <w:pPr>
+        <w:keepNext/>
         <w:spacing w:after="20"/>
         <w:jc w:val="center"/>
       </w:pPr>
@@ -3318,6 +3323,7 @@
     </w:p>
     <w:p>
       <w:pPr>
+        <w:keepNext/>
         <w:spacing w:after="60"/>
         <w:jc w:val="center"/>
       </w:pPr>
@@ -3352,12 +3358,12 @@
               <w:end w:w="60" w:type="dxa"/>
             </w:tcMar>
             <w:tcBorders>
-              <w:top w:val="single" w:sz="4" w:color="BFBFBF"/>
-              <w:bottom w:val="single" w:sz="4" w:color="BFBFBF"/>
-              <w:left w:val="single" w:sz="4" w:color="BFBFBF"/>
-              <w:right w:val="single" w:sz="4" w:color="BFBFBF"/>
+              <w:top w:val="single" w:sz="4" w:color="808080"/>
+              <w:bottom w:val="single" w:sz="4" w:color="808080"/>
+              <w:left w:val="single" w:sz="4" w:color="808080"/>
+              <w:right w:val="single" w:sz="4" w:color="808080"/>
             </w:tcBorders>
-            <w:shd w:fill="EAF2F8"/>
+            <w:shd w:fill="F2F2F2"/>
           </w:tcPr>
           <w:p>
             <w:pPr>
@@ -3417,10 +3423,10 @@
               <w:end w:w="60" w:type="dxa"/>
             </w:tcMar>
             <w:tcBorders>
-              <w:top w:val="single" w:sz="4" w:color="BFBFBF"/>
-              <w:bottom w:val="single" w:sz="4" w:color="BFBFBF"/>
-              <w:left w:val="single" w:sz="4" w:color="BFBFBF"/>
-              <w:right w:val="single" w:sz="4" w:color="BFBFBF"/>
+              <w:top w:val="single" w:sz="4" w:color="808080"/>
+              <w:bottom w:val="single" w:sz="4" w:color="808080"/>
+              <w:left w:val="single" w:sz="4" w:color="808080"/>
+              <w:right w:val="single" w:sz="4" w:color="808080"/>
             </w:tcBorders>
             <w:shd w:fill="F2F2F2"/>
           </w:tcPr>
@@ -3475,10 +3481,10 @@
               <w:end w:w="60" w:type="dxa"/>
             </w:tcMar>
             <w:tcBorders>
-              <w:top w:val="single" w:sz="4" w:color="BFBFBF"/>
-              <w:bottom w:val="single" w:sz="4" w:color="BFBFBF"/>
-              <w:left w:val="single" w:sz="4" w:color="BFBFBF"/>
-              <w:right w:val="single" w:sz="4" w:color="BFBFBF"/>
+              <w:top w:val="single" w:sz="4" w:color="808080"/>
+              <w:bottom w:val="single" w:sz="4" w:color="808080"/>
+              <w:left w:val="single" w:sz="4" w:color="808080"/>
+              <w:right w:val="single" w:sz="4" w:color="808080"/>
             </w:tcBorders>
           </w:tcPr>
           <w:p>
@@ -3665,10 +3671,10 @@
               <w:end w:w="60" w:type="dxa"/>
             </w:tcMar>
             <w:tcBorders>
-              <w:top w:val="single" w:sz="4" w:color="BFBFBF"/>
-              <w:bottom w:val="single" w:sz="4" w:color="BFBFBF"/>
-              <w:left w:val="single" w:sz="4" w:color="BFBFBF"/>
-              <w:right w:val="single" w:sz="4" w:color="BFBFBF"/>
+              <w:top w:val="single" w:sz="4" w:color="808080"/>
+              <w:bottom w:val="single" w:sz="4" w:color="808080"/>
+              <w:left w:val="single" w:sz="4" w:color="808080"/>
+              <w:right w:val="single" w:sz="4" w:color="808080"/>
             </w:tcBorders>
           </w:tcPr>
           <w:p>
@@ -3877,12 +3883,12 @@
               <w:end w:w="60" w:type="dxa"/>
             </w:tcMar>
             <w:tcBorders>
-              <w:top w:val="single" w:sz="4" w:color="BFBFBF"/>
-              <w:bottom w:val="single" w:sz="4" w:color="BFBFBF"/>
-              <w:left w:val="single" w:sz="4" w:color="BFBFBF"/>
-              <w:right w:val="single" w:sz="4" w:color="BFBFBF"/>
+              <w:top w:val="single" w:sz="4" w:color="808080"/>
+              <w:bottom w:val="single" w:sz="4" w:color="808080"/>
+              <w:left w:val="single" w:sz="4" w:color="808080"/>
+              <w:right w:val="single" w:sz="4" w:color="808080"/>
             </w:tcBorders>
-            <w:shd w:fill="FCE4D6"/>
+            <w:shd w:fill="E3E3E3"/>
           </w:tcPr>
           <w:p>
             <w:pPr>
@@ -3971,12 +3977,12 @@
               <w:end w:w="60" w:type="dxa"/>
             </w:tcMar>
             <w:tcBorders>
-              <w:top w:val="single" w:sz="4" w:color="BFBFBF"/>
-              <w:bottom w:val="single" w:sz="4" w:color="BFBFBF"/>
-              <w:left w:val="single" w:sz="4" w:color="BFBFBF"/>
-              <w:right w:val="single" w:sz="4" w:color="BFBFBF"/>
+              <w:top w:val="single" w:sz="4" w:color="808080"/>
+              <w:bottom w:val="single" w:sz="4" w:color="808080"/>
+              <w:left w:val="single" w:sz="4" w:color="808080"/>
+              <w:right w:val="single" w:sz="4" w:color="808080"/>
             </w:tcBorders>
-            <w:shd w:fill="FFF2CC"/>
+            <w:shd w:fill="E3E3E3"/>
           </w:tcPr>
           <w:p>
             <w:pPr>
@@ -4071,10 +4077,10 @@
               <w:end w:w="60" w:type="dxa"/>
             </w:tcMar>
             <w:tcBorders>
-              <w:top w:val="single" w:sz="4" w:color="BFBFBF"/>
-              <w:bottom w:val="single" w:sz="4" w:color="BFBFBF"/>
-              <w:left w:val="single" w:sz="4" w:color="BFBFBF"/>
-              <w:right w:val="single" w:sz="4" w:color="BFBFBF"/>
+              <w:top w:val="single" w:sz="4" w:color="808080"/>
+              <w:bottom w:val="single" w:sz="4" w:color="808080"/>
+              <w:left w:val="single" w:sz="4" w:color="808080"/>
+              <w:right w:val="single" w:sz="4" w:color="808080"/>
             </w:tcBorders>
           </w:tcPr>
           <w:p>
@@ -4156,10 +4162,10 @@
               <w:end w:w="60" w:type="dxa"/>
             </w:tcMar>
             <w:tcBorders>
-              <w:top w:val="single" w:sz="4" w:color="BFBFBF"/>
-              <w:bottom w:val="single" w:sz="4" w:color="BFBFBF"/>
-              <w:left w:val="single" w:sz="4" w:color="BFBFBF"/>
-              <w:right w:val="single" w:sz="4" w:color="BFBFBF"/>
+              <w:top w:val="single" w:sz="4" w:color="808080"/>
+              <w:bottom w:val="single" w:sz="4" w:color="808080"/>
+              <w:left w:val="single" w:sz="4" w:color="808080"/>
+              <w:right w:val="single" w:sz="4" w:color="808080"/>
             </w:tcBorders>
           </w:tcPr>
           <w:p>
@@ -4241,12 +4247,12 @@
               <w:end w:w="60" w:type="dxa"/>
             </w:tcMar>
             <w:tcBorders>
-              <w:top w:val="single" w:sz="4" w:color="BFBFBF"/>
-              <w:bottom w:val="single" w:sz="4" w:color="BFBFBF"/>
-              <w:left w:val="single" w:sz="4" w:color="BFBFBF"/>
-              <w:right w:val="single" w:sz="4" w:color="BFBFBF"/>
+              <w:top w:val="single" w:sz="4" w:color="808080"/>
+              <w:bottom w:val="single" w:sz="4" w:color="808080"/>
+              <w:left w:val="single" w:sz="4" w:color="808080"/>
+              <w:right w:val="single" w:sz="4" w:color="808080"/>
             </w:tcBorders>
-            <w:shd w:fill="F7F7F7"/>
+            <w:shd w:fill="FFFFFF"/>
           </w:tcPr>
           <w:p>
             <w:pPr>
@@ -4298,12 +4304,12 @@
               <w:end w:w="75" w:type="dxa"/>
             </w:tcMar>
             <w:tcBorders>
-              <w:top w:val="single" w:sz="6" w:color="70AD47"/>
-              <w:bottom w:val="single" w:sz="6" w:color="70AD47"/>
-              <w:left w:val="single" w:sz="6" w:color="70AD47"/>
-              <w:right w:val="single" w:sz="6" w:color="70AD47"/>
+              <w:top w:val="single" w:sz="6" w:color="000000"/>
+              <w:bottom w:val="single" w:sz="6" w:color="000000"/>
+              <w:left w:val="single" w:sz="6" w:color="000000"/>
+              <w:right w:val="single" w:sz="6" w:color="000000"/>
             </w:tcBorders>
-            <w:shd w:fill="E2F0D9"/>
+            <w:shd w:fill="D0D0D0"/>
           </w:tcPr>
           <w:p>
             <w:pPr>
@@ -4355,12 +4361,12 @@
               <w:end w:w="70" w:type="dxa"/>
             </w:tcMar>
             <w:tcBorders>
-              <w:top w:val="single" w:sz="4" w:color="9FBAD0"/>
-              <w:bottom w:val="single" w:sz="4" w:color="9FBAD0"/>
-              <w:left w:val="single" w:sz="4" w:color="9FBAD0"/>
-              <w:right w:val="single" w:sz="4" w:color="9FBAD0"/>
+              <w:top w:val="single" w:sz="4" w:color="000000"/>
+              <w:bottom w:val="single" w:sz="4" w:color="000000"/>
+              <w:left w:val="single" w:sz="4" w:color="000000"/>
+              <w:right w:val="single" w:sz="4" w:color="000000"/>
             </w:tcBorders>
-            <w:shd w:fill="EAF2F8"/>
+            <w:shd w:fill="F2F2F2"/>
           </w:tcPr>
           <w:p>
             <w:pPr>
@@ -4421,9 +4427,6 @@
         <w:gridCol w:w="5556"/>
       </w:tblGrid>
       <w:tr>
-        <w:trPr>
-          <w:cantSplit/>
-        </w:trPr>
         <w:tc>
           <w:tcPr>
             <w:tcW w:type="dxa" w:w="5556"/>
@@ -4434,12 +4437,12 @@
               <w:end w:w="60" w:type="dxa"/>
             </w:tcMar>
             <w:tcBorders>
-              <w:top w:val="single" w:sz="4" w:color="BFBFBF"/>
-              <w:bottom w:val="single" w:sz="4" w:color="BFBFBF"/>
-              <w:left w:val="single" w:sz="4" w:color="BFBFBF"/>
-              <w:right w:val="single" w:sz="4" w:color="BFBFBF"/>
+              <w:top w:val="single" w:sz="4" w:color="808080"/>
+              <w:bottom w:val="single" w:sz="4" w:color="808080"/>
+              <w:left w:val="single" w:sz="4" w:color="808080"/>
+              <w:right w:val="single" w:sz="4" w:color="808080"/>
             </w:tcBorders>
-            <w:shd w:fill="EAF2F8"/>
+            <w:shd w:fill="F2F2F2"/>
           </w:tcPr>
           <w:p>
             <w:pPr>
@@ -4505,10 +4508,10 @@
               <w:end w:w="60" w:type="dxa"/>
             </w:tcMar>
             <w:tcBorders>
-              <w:top w:val="single" w:sz="4" w:color="BFBFBF"/>
-              <w:bottom w:val="single" w:sz="4" w:color="BFBFBF"/>
-              <w:left w:val="single" w:sz="4" w:color="BFBFBF"/>
-              <w:right w:val="single" w:sz="4" w:color="BFBFBF"/>
+              <w:top w:val="single" w:sz="4" w:color="808080"/>
+              <w:bottom w:val="single" w:sz="4" w:color="808080"/>
+              <w:left w:val="single" w:sz="4" w:color="808080"/>
+              <w:right w:val="single" w:sz="4" w:color="808080"/>
             </w:tcBorders>
             <w:shd w:fill="F2F2F2"/>
           </w:tcPr>
@@ -4568,9 +4571,6 @@
         <w:gridCol w:w="3685"/>
       </w:tblGrid>
       <w:tr>
-        <w:trPr>
-          <w:cantSplit/>
-        </w:trPr>
         <w:tc>
           <w:tcPr>
             <w:tcW w:type="dxa" w:w="3713"/>
@@ -4581,12 +4581,12 @@
               <w:end w:w="60" w:type="dxa"/>
             </w:tcMar>
             <w:tcBorders>
-              <w:top w:val="single" w:sz="4" w:color="BFBFBF"/>
-              <w:bottom w:val="single" w:sz="4" w:color="BFBFBF"/>
-              <w:left w:val="single" w:sz="4" w:color="BFBFBF"/>
-              <w:right w:val="single" w:sz="4" w:color="BFBFBF"/>
+              <w:top w:val="single" w:sz="4" w:color="808080"/>
+              <w:bottom w:val="single" w:sz="4" w:color="808080"/>
+              <w:left w:val="single" w:sz="4" w:color="808080"/>
+              <w:right w:val="single" w:sz="4" w:color="808080"/>
             </w:tcBorders>
-            <w:shd w:fill="F7F7F7"/>
+            <w:shd w:fill="FFFFFF"/>
           </w:tcPr>
           <w:p>
             <w:pPr>
@@ -4652,12 +4652,12 @@
               <w:end w:w="60" w:type="dxa"/>
             </w:tcMar>
             <w:tcBorders>
-              <w:top w:val="single" w:sz="4" w:color="BFBFBF"/>
-              <w:bottom w:val="single" w:sz="4" w:color="BFBFBF"/>
-              <w:left w:val="single" w:sz="4" w:color="BFBFBF"/>
-              <w:right w:val="single" w:sz="4" w:color="BFBFBF"/>
+              <w:top w:val="single" w:sz="4" w:color="808080"/>
+              <w:bottom w:val="single" w:sz="4" w:color="808080"/>
+              <w:left w:val="single" w:sz="4" w:color="808080"/>
+              <w:right w:val="single" w:sz="4" w:color="808080"/>
             </w:tcBorders>
-            <w:shd w:fill="F7F7F7"/>
+            <w:shd w:fill="FFFFFF"/>
           </w:tcPr>
           <w:p>
             <w:pPr>
@@ -4737,12 +4737,12 @@
               <w:end w:w="60" w:type="dxa"/>
             </w:tcMar>
             <w:tcBorders>
-              <w:top w:val="single" w:sz="4" w:color="BFBFBF"/>
-              <w:bottom w:val="single" w:sz="4" w:color="BFBFBF"/>
-              <w:left w:val="single" w:sz="4" w:color="BFBFBF"/>
-              <w:right w:val="single" w:sz="4" w:color="BFBFBF"/>
+              <w:top w:val="single" w:sz="4" w:color="808080"/>
+              <w:bottom w:val="single" w:sz="4" w:color="808080"/>
+              <w:left w:val="single" w:sz="4" w:color="808080"/>
+              <w:right w:val="single" w:sz="4" w:color="808080"/>
             </w:tcBorders>
-            <w:shd w:fill="F7F7F7"/>
+            <w:shd w:fill="FFFFFF"/>
           </w:tcPr>
           <w:p>
             <w:pPr>
@@ -4811,9 +4811,6 @@
         <w:gridCol w:w="11113"/>
       </w:tblGrid>
       <w:tr>
-        <w:trPr>
-          <w:cantSplit/>
-        </w:trPr>
         <w:tc>
           <w:tcPr>
             <w:tcW w:type="dxa" w:w="11113"/>
@@ -4824,12 +4821,12 @@
               <w:end w:w="60" w:type="dxa"/>
             </w:tcMar>
             <w:tcBorders>
-              <w:top w:val="single" w:sz="4" w:color="A6A6A6"/>
-              <w:bottom w:val="single" w:sz="4" w:color="A6A6A6"/>
-              <w:left w:val="single" w:sz="4" w:color="A6A6A6"/>
-              <w:right w:val="single" w:sz="4" w:color="A6A6A6"/>
+              <w:top w:val="single" w:sz="4" w:color="808080"/>
+              <w:bottom w:val="single" w:sz="4" w:color="808080"/>
+              <w:left w:val="single" w:sz="4" w:color="808080"/>
+              <w:right w:val="single" w:sz="4" w:color="808080"/>
             </w:tcBorders>
-            <w:shd w:fill="FCE4D6"/>
+            <w:shd w:fill="E3E3E3"/>
           </w:tcPr>
           <w:p>
             <w:pPr>
@@ -4861,9 +4858,6 @@
         <w:gridCol w:w="2778"/>
       </w:tblGrid>
       <w:tr>
-        <w:trPr>
-          <w:cantSplit/>
-        </w:trPr>
         <w:tc>
           <w:tcPr>
             <w:tcW w:type="dxa" w:w="5556"/>
@@ -4874,10 +4868,10 @@
               <w:end w:w="60" w:type="dxa"/>
             </w:tcMar>
             <w:tcBorders>
-              <w:top w:val="single" w:sz="4" w:color="BFBFBF"/>
-              <w:bottom w:val="single" w:sz="4" w:color="BFBFBF"/>
-              <w:left w:val="single" w:sz="4" w:color="BFBFBF"/>
-              <w:right w:val="single" w:sz="4" w:color="BFBFBF"/>
+              <w:top w:val="single" w:sz="4" w:color="808080"/>
+              <w:bottom w:val="single" w:sz="4" w:color="808080"/>
+              <w:left w:val="single" w:sz="4" w:color="808080"/>
+              <w:right w:val="single" w:sz="4" w:color="808080"/>
             </w:tcBorders>
             <w:shd w:fill="F2F2F2"/>
           </w:tcPr>
@@ -4984,12 +4978,12 @@
               <w:end w:w="60" w:type="dxa"/>
             </w:tcMar>
             <w:tcBorders>
-              <w:top w:val="single" w:sz="4" w:color="BFBFBF"/>
-              <w:bottom w:val="single" w:sz="4" w:color="BFBFBF"/>
-              <w:left w:val="single" w:sz="4" w:color="BFBFBF"/>
-              <w:right w:val="single" w:sz="4" w:color="BFBFBF"/>
+              <w:top w:val="single" w:sz="4" w:color="808080"/>
+              <w:bottom w:val="single" w:sz="4" w:color="808080"/>
+              <w:left w:val="single" w:sz="4" w:color="808080"/>
+              <w:right w:val="single" w:sz="4" w:color="808080"/>
             </w:tcBorders>
-            <w:shd w:fill="EAF2F8"/>
+            <w:shd w:fill="F2F2F2"/>
           </w:tcPr>
           <w:p>
             <w:pPr>
@@ -5042,12 +5036,12 @@
               <w:end w:w="60" w:type="dxa"/>
             </w:tcMar>
             <w:tcBorders>
-              <w:top w:val="single" w:sz="4" w:color="BFBFBF"/>
-              <w:bottom w:val="single" w:sz="4" w:color="BFBFBF"/>
-              <w:left w:val="single" w:sz="4" w:color="BFBFBF"/>
-              <w:right w:val="single" w:sz="4" w:color="BFBFBF"/>
+              <w:top w:val="single" w:sz="4" w:color="808080"/>
+              <w:bottom w:val="single" w:sz="4" w:color="808080"/>
+              <w:left w:val="single" w:sz="4" w:color="808080"/>
+              <w:right w:val="single" w:sz="4" w:color="808080"/>
             </w:tcBorders>
-            <w:shd w:fill="F7F7F7"/>
+            <w:shd w:fill="FFFFFF"/>
           </w:tcPr>
           <w:p>
             <w:pPr>
@@ -5117,9 +5111,6 @@
         <w:gridCol w:w="5556"/>
       </w:tblGrid>
       <w:tr>
-        <w:trPr>
-          <w:cantSplit/>
-        </w:trPr>
         <w:tc>
           <w:tcPr>
             <w:tcW w:type="dxa" w:w="5556"/>
@@ -5130,12 +5121,12 @@
               <w:end w:w="60" w:type="dxa"/>
             </w:tcMar>
             <w:tcBorders>
-              <w:top w:val="single" w:sz="4" w:color="BFBFBF"/>
-              <w:bottom w:val="single" w:sz="4" w:color="BFBFBF"/>
-              <w:left w:val="single" w:sz="4" w:color="BFBFBF"/>
-              <w:right w:val="single" w:sz="4" w:color="BFBFBF"/>
+              <w:top w:val="single" w:sz="4" w:color="808080"/>
+              <w:bottom w:val="single" w:sz="4" w:color="808080"/>
+              <w:left w:val="single" w:sz="4" w:color="808080"/>
+              <w:right w:val="single" w:sz="4" w:color="808080"/>
             </w:tcBorders>
-            <w:shd w:fill="FFF2CC"/>
+            <w:shd w:fill="E3E3E3"/>
           </w:tcPr>
           <w:p>
             <w:pPr>
@@ -5204,12 +5195,12 @@
               <w:end w:w="60" w:type="dxa"/>
             </w:tcMar>
             <w:tcBorders>
-              <w:top w:val="single" w:sz="4" w:color="BFBFBF"/>
-              <w:bottom w:val="single" w:sz="4" w:color="BFBFBF"/>
-              <w:left w:val="single" w:sz="4" w:color="BFBFBF"/>
-              <w:right w:val="single" w:sz="4" w:color="BFBFBF"/>
+              <w:top w:val="single" w:sz="4" w:color="808080"/>
+              <w:bottom w:val="single" w:sz="4" w:color="808080"/>
+              <w:left w:val="single" w:sz="4" w:color="808080"/>
+              <w:right w:val="single" w:sz="4" w:color="808080"/>
             </w:tcBorders>
-            <w:shd w:fill="FFF2CC"/>
+            <w:shd w:fill="E3E3E3"/>
           </w:tcPr>
           <w:p>
             <w:pPr>
@@ -5268,9 +5259,6 @@
         <w:gridCol w:w="5556"/>
       </w:tblGrid>
       <w:tr>
-        <w:trPr>
-          <w:cantSplit/>
-        </w:trPr>
         <w:tc>
           <w:tcPr>
             <w:tcW w:type="dxa" w:w="5556"/>
@@ -5281,12 +5269,12 @@
               <w:end w:w="60" w:type="dxa"/>
             </w:tcMar>
             <w:tcBorders>
-              <w:top w:val="single" w:sz="4" w:color="BFBFBF"/>
-              <w:bottom w:val="single" w:sz="4" w:color="BFBFBF"/>
-              <w:left w:val="single" w:sz="4" w:color="BFBFBF"/>
-              <w:right w:val="single" w:sz="4" w:color="BFBFBF"/>
+              <w:top w:val="single" w:sz="4" w:color="808080"/>
+              <w:bottom w:val="single" w:sz="4" w:color="808080"/>
+              <w:left w:val="single" w:sz="4" w:color="808080"/>
+              <w:right w:val="single" w:sz="4" w:color="808080"/>
             </w:tcBorders>
-            <w:shd w:fill="EAF2F8"/>
+            <w:shd w:fill="F2F2F2"/>
           </w:tcPr>
           <w:p>
             <w:pPr>
@@ -5379,10 +5367,10 @@
               <w:end w:w="60" w:type="dxa"/>
             </w:tcMar>
             <w:tcBorders>
-              <w:top w:val="single" w:sz="4" w:color="BFBFBF"/>
-              <w:bottom w:val="single" w:sz="4" w:color="BFBFBF"/>
-              <w:left w:val="single" w:sz="4" w:color="BFBFBF"/>
-              <w:right w:val="single" w:sz="4" w:color="BFBFBF"/>
+              <w:top w:val="single" w:sz="4" w:color="808080"/>
+              <w:bottom w:val="single" w:sz="4" w:color="808080"/>
+              <w:left w:val="single" w:sz="4" w:color="808080"/>
+              <w:right w:val="single" w:sz="4" w:color="808080"/>
             </w:tcBorders>
             <w:shd w:fill="F2F2F2"/>
           </w:tcPr>
@@ -5467,9 +5455,6 @@
         <w:gridCol w:w="5556"/>
       </w:tblGrid>
       <w:tr>
-        <w:trPr>
-          <w:cantSplit/>
-        </w:trPr>
         <w:tc>
           <w:tcPr>
             <w:tcW w:type="dxa" w:w="5556"/>
@@ -5480,12 +5465,12 @@
               <w:end w:w="60" w:type="dxa"/>
             </w:tcMar>
             <w:tcBorders>
-              <w:top w:val="single" w:sz="4" w:color="BFBFBF"/>
-              <w:bottom w:val="single" w:sz="4" w:color="BFBFBF"/>
-              <w:left w:val="single" w:sz="4" w:color="BFBFBF"/>
-              <w:right w:val="single" w:sz="4" w:color="BFBFBF"/>
+              <w:top w:val="single" w:sz="4" w:color="808080"/>
+              <w:bottom w:val="single" w:sz="4" w:color="808080"/>
+              <w:left w:val="single" w:sz="4" w:color="808080"/>
+              <w:right w:val="single" w:sz="4" w:color="808080"/>
             </w:tcBorders>
-            <w:shd w:fill="F7F7F7"/>
+            <w:shd w:fill="FFFFFF"/>
           </w:tcPr>
           <w:p>
             <w:pPr>
@@ -5590,12 +5575,12 @@
               <w:end w:w="60" w:type="dxa"/>
             </w:tcMar>
             <w:tcBorders>
-              <w:top w:val="single" w:sz="4" w:color="BFBFBF"/>
-              <w:bottom w:val="single" w:sz="4" w:color="BFBFBF"/>
-              <w:left w:val="single" w:sz="4" w:color="BFBFBF"/>
-              <w:right w:val="single" w:sz="4" w:color="BFBFBF"/>
+              <w:top w:val="single" w:sz="4" w:color="808080"/>
+              <w:bottom w:val="single" w:sz="4" w:color="808080"/>
+              <w:left w:val="single" w:sz="4" w:color="808080"/>
+              <w:right w:val="single" w:sz="4" w:color="808080"/>
             </w:tcBorders>
-            <w:shd w:fill="F7F7F7"/>
+            <w:shd w:fill="FFFFFF"/>
           </w:tcPr>
           <w:p>
             <w:pPr>
@@ -5690,9 +5675,6 @@
         <w:gridCol w:w="11113"/>
       </w:tblGrid>
       <w:tr>
-        <w:trPr>
-          <w:cantSplit/>
-        </w:trPr>
         <w:tc>
           <w:tcPr>
             <w:tcW w:type="dxa" w:w="11113"/>
@@ -5703,12 +5685,12 @@
               <w:end w:w="60" w:type="dxa"/>
             </w:tcMar>
             <w:tcBorders>
-              <w:top w:val="single" w:sz="6" w:color="70AD47"/>
-              <w:bottom w:val="single" w:sz="6" w:color="70AD47"/>
-              <w:left w:val="single" w:sz="6" w:color="70AD47"/>
-              <w:right w:val="single" w:sz="6" w:color="70AD47"/>
+              <w:top w:val="single" w:sz="6" w:color="000000"/>
+              <w:bottom w:val="single" w:sz="6" w:color="000000"/>
+              <w:left w:val="single" w:sz="6" w:color="000000"/>
+              <w:right w:val="single" w:sz="6" w:color="000000"/>
             </w:tcBorders>
-            <w:shd w:fill="E2F0D9"/>
+            <w:shd w:fill="D0D0D0"/>
           </w:tcPr>
           <w:p>
             <w:pPr>
@@ -5751,9 +5733,6 @@
         <w:gridCol w:w="11113"/>
       </w:tblGrid>
       <w:tr>
-        <w:trPr>
-          <w:cantSplit/>
-        </w:trPr>
         <w:tc>
           <w:tcPr>
             <w:tcW w:type="dxa" w:w="11113"/>
@@ -5764,12 +5743,12 @@
               <w:end w:w="60" w:type="dxa"/>
             </w:tcMar>
             <w:tcBorders>
-              <w:top w:val="single" w:sz="4" w:color="A6A6A6"/>
-              <w:bottom w:val="single" w:sz="4" w:color="A6A6A6"/>
-              <w:left w:val="single" w:sz="4" w:color="A6A6A6"/>
-              <w:right w:val="single" w:sz="4" w:color="A6A6A6"/>
+              <w:top w:val="single" w:sz="4" w:color="808080"/>
+              <w:bottom w:val="single" w:sz="4" w:color="808080"/>
+              <w:left w:val="single" w:sz="4" w:color="808080"/>
+              <w:right w:val="single" w:sz="4" w:color="808080"/>
             </w:tcBorders>
-            <w:shd w:fill="FFF2CC"/>
+            <w:shd w:fill="E3E3E3"/>
           </w:tcPr>
           <w:p>
             <w:pPr>
@@ -5908,9 +5887,6 @@
         <w:gridCol w:w="5556"/>
       </w:tblGrid>
       <w:tr>
-        <w:trPr>
-          <w:cantSplit/>
-        </w:trPr>
         <w:tc>
           <w:tcPr>
             <w:tcW w:type="dxa" w:w="5556"/>
@@ -5921,12 +5897,12 @@
               <w:end w:w="60" w:type="dxa"/>
             </w:tcMar>
             <w:tcBorders>
-              <w:top w:val="single" w:sz="4" w:color="BFBFBF"/>
-              <w:bottom w:val="single" w:sz="4" w:color="BFBFBF"/>
-              <w:left w:val="single" w:sz="4" w:color="BFBFBF"/>
-              <w:right w:val="single" w:sz="4" w:color="BFBFBF"/>
+              <w:top w:val="single" w:sz="4" w:color="808080"/>
+              <w:bottom w:val="single" w:sz="4" w:color="808080"/>
+              <w:left w:val="single" w:sz="4" w:color="808080"/>
+              <w:right w:val="single" w:sz="4" w:color="808080"/>
             </w:tcBorders>
-            <w:shd w:fill="EAF2F8"/>
+            <w:shd w:fill="F2F2F2"/>
           </w:tcPr>
           <w:p>
             <w:pPr>
@@ -5979,10 +5955,10 @@
               <w:end w:w="60" w:type="dxa"/>
             </w:tcMar>
             <w:tcBorders>
-              <w:top w:val="single" w:sz="4" w:color="BFBFBF"/>
-              <w:bottom w:val="single" w:sz="4" w:color="BFBFBF"/>
-              <w:left w:val="single" w:sz="4" w:color="BFBFBF"/>
-              <w:right w:val="single" w:sz="4" w:color="BFBFBF"/>
+              <w:top w:val="single" w:sz="4" w:color="808080"/>
+              <w:bottom w:val="single" w:sz="4" w:color="808080"/>
+              <w:left w:val="single" w:sz="4" w:color="808080"/>
+              <w:right w:val="single" w:sz="4" w:color="808080"/>
             </w:tcBorders>
             <w:shd w:fill="F2F2F2"/>
           </w:tcPr>
@@ -6041,9 +6017,6 @@
         <w:gridCol w:w="5556"/>
       </w:tblGrid>
       <w:tr>
-        <w:trPr>
-          <w:cantSplit/>
-        </w:trPr>
         <w:tc>
           <w:tcPr>
             <w:tcW w:type="dxa" w:w="5556"/>
@@ -6054,12 +6027,12 @@
               <w:end w:w="60" w:type="dxa"/>
             </w:tcMar>
             <w:tcBorders>
-              <w:top w:val="single" w:sz="4" w:color="BFBFBF"/>
-              <w:bottom w:val="single" w:sz="4" w:color="BFBFBF"/>
-              <w:left w:val="single" w:sz="4" w:color="BFBFBF"/>
-              <w:right w:val="single" w:sz="4" w:color="BFBFBF"/>
+              <w:top w:val="single" w:sz="4" w:color="808080"/>
+              <w:bottom w:val="single" w:sz="4" w:color="808080"/>
+              <w:left w:val="single" w:sz="4" w:color="808080"/>
+              <w:right w:val="single" w:sz="4" w:color="808080"/>
             </w:tcBorders>
-            <w:shd w:fill="F7F7F7"/>
+            <w:shd w:fill="FFFFFF"/>
           </w:tcPr>
           <w:p>
             <w:pPr>
@@ -6212,12 +6185,12 @@
               <w:end w:w="60" w:type="dxa"/>
             </w:tcMar>
             <w:tcBorders>
-              <w:top w:val="single" w:sz="4" w:color="BFBFBF"/>
-              <w:bottom w:val="single" w:sz="4" w:color="BFBFBF"/>
-              <w:left w:val="single" w:sz="4" w:color="BFBFBF"/>
-              <w:right w:val="single" w:sz="4" w:color="BFBFBF"/>
+              <w:top w:val="single" w:sz="4" w:color="808080"/>
+              <w:bottom w:val="single" w:sz="4" w:color="808080"/>
+              <w:left w:val="single" w:sz="4" w:color="808080"/>
+              <w:right w:val="single" w:sz="4" w:color="808080"/>
             </w:tcBorders>
-            <w:shd w:fill="F7F7F7"/>
+            <w:shd w:fill="FFFFFF"/>
           </w:tcPr>
           <w:p>
             <w:pPr>
@@ -6326,9 +6299,6 @@
         <w:gridCol w:w="5556"/>
       </w:tblGrid>
       <w:tr>
-        <w:trPr>
-          <w:cantSplit/>
-        </w:trPr>
         <w:tc>
           <w:tcPr>
             <w:tcW w:type="dxa" w:w="5556"/>
@@ -6339,12 +6309,12 @@
               <w:end w:w="60" w:type="dxa"/>
             </w:tcMar>
             <w:tcBorders>
-              <w:top w:val="single" w:sz="4" w:color="BFBFBF"/>
-              <w:bottom w:val="single" w:sz="4" w:color="BFBFBF"/>
-              <w:left w:val="single" w:sz="4" w:color="BFBFBF"/>
-              <w:right w:val="single" w:sz="4" w:color="BFBFBF"/>
+              <w:top w:val="single" w:sz="4" w:color="808080"/>
+              <w:bottom w:val="single" w:sz="4" w:color="808080"/>
+              <w:left w:val="single" w:sz="4" w:color="808080"/>
+              <w:right w:val="single" w:sz="4" w:color="808080"/>
             </w:tcBorders>
-            <w:shd w:fill="FFF2CC"/>
+            <w:shd w:fill="E3E3E3"/>
           </w:tcPr>
           <w:p>
             <w:pPr>
@@ -6384,12 +6354,12 @@
               <w:end w:w="60" w:type="dxa"/>
             </w:tcMar>
             <w:tcBorders>
-              <w:top w:val="single" w:sz="4" w:color="BFBFBF"/>
-              <w:bottom w:val="single" w:sz="4" w:color="BFBFBF"/>
-              <w:left w:val="single" w:sz="4" w:color="BFBFBF"/>
-              <w:right w:val="single" w:sz="4" w:color="BFBFBF"/>
+              <w:top w:val="single" w:sz="4" w:color="808080"/>
+              <w:bottom w:val="single" w:sz="4" w:color="808080"/>
+              <w:left w:val="single" w:sz="4" w:color="808080"/>
+              <w:right w:val="single" w:sz="4" w:color="808080"/>
             </w:tcBorders>
-            <w:shd w:fill="FCE4D6"/>
+            <w:shd w:fill="E3E3E3"/>
           </w:tcPr>
           <w:p>
             <w:pPr>
@@ -6432,9 +6402,6 @@
         <w:gridCol w:w="11113"/>
       </w:tblGrid>
       <w:tr>
-        <w:trPr>
-          <w:cantSplit/>
-        </w:trPr>
         <w:tc>
           <w:tcPr>
             <w:tcW w:type="dxa" w:w="11113"/>
@@ -6445,12 +6412,12 @@
               <w:end w:w="60" w:type="dxa"/>
             </w:tcMar>
             <w:tcBorders>
-              <w:top w:val="single" w:sz="6" w:color="70AD47"/>
-              <w:bottom w:val="single" w:sz="6" w:color="70AD47"/>
-              <w:left w:val="single" w:sz="6" w:color="70AD47"/>
-              <w:right w:val="single" w:sz="6" w:color="70AD47"/>
+              <w:top w:val="single" w:sz="6" w:color="000000"/>
+              <w:bottom w:val="single" w:sz="6" w:color="000000"/>
+              <w:left w:val="single" w:sz="6" w:color="000000"/>
+              <w:right w:val="single" w:sz="6" w:color="000000"/>
             </w:tcBorders>
-            <w:shd w:fill="E2F0D9"/>
+            <w:shd w:fill="D0D0D0"/>
           </w:tcPr>
           <w:p>
             <w:pPr>
@@ -6524,9 +6491,6 @@
         <w:gridCol w:w="5556"/>
       </w:tblGrid>
       <w:tr>
-        <w:trPr>
-          <w:cantSplit/>
-        </w:trPr>
         <w:tc>
           <w:tcPr>
             <w:tcW w:type="dxa" w:w="5556"/>
@@ -6537,12 +6501,12 @@
               <w:end w:w="60" w:type="dxa"/>
             </w:tcMar>
             <w:tcBorders>
-              <w:top w:val="single" w:sz="4" w:color="BFBFBF"/>
-              <w:bottom w:val="single" w:sz="4" w:color="BFBFBF"/>
-              <w:left w:val="single" w:sz="4" w:color="BFBFBF"/>
-              <w:right w:val="single" w:sz="4" w:color="BFBFBF"/>
+              <w:top w:val="single" w:sz="4" w:color="808080"/>
+              <w:bottom w:val="single" w:sz="4" w:color="808080"/>
+              <w:left w:val="single" w:sz="4" w:color="808080"/>
+              <w:right w:val="single" w:sz="4" w:color="808080"/>
             </w:tcBorders>
-            <w:shd w:fill="EAF2F8"/>
+            <w:shd w:fill="F2F2F2"/>
           </w:tcPr>
           <w:p>
             <w:pPr>
@@ -6608,10 +6572,10 @@
               <w:end w:w="60" w:type="dxa"/>
             </w:tcMar>
             <w:tcBorders>
-              <w:top w:val="single" w:sz="4" w:color="BFBFBF"/>
-              <w:bottom w:val="single" w:sz="4" w:color="BFBFBF"/>
-              <w:left w:val="single" w:sz="4" w:color="BFBFBF"/>
-              <w:right w:val="single" w:sz="4" w:color="BFBFBF"/>
+              <w:top w:val="single" w:sz="4" w:color="808080"/>
+              <w:bottom w:val="single" w:sz="4" w:color="808080"/>
+              <w:left w:val="single" w:sz="4" w:color="808080"/>
+              <w:right w:val="single" w:sz="4" w:color="808080"/>
             </w:tcBorders>
             <w:shd w:fill="F2F2F2"/>
           </w:tcPr>
@@ -6683,9 +6647,6 @@
         <w:gridCol w:w="5556"/>
       </w:tblGrid>
       <w:tr>
-        <w:trPr>
-          <w:cantSplit/>
-        </w:trPr>
         <w:tc>
           <w:tcPr>
             <w:tcW w:type="dxa" w:w="5556"/>
@@ -6696,12 +6657,12 @@
               <w:end w:w="60" w:type="dxa"/>
             </w:tcMar>
             <w:tcBorders>
-              <w:top w:val="single" w:sz="4" w:color="BFBFBF"/>
-              <w:bottom w:val="single" w:sz="4" w:color="BFBFBF"/>
-              <w:left w:val="single" w:sz="4" w:color="BFBFBF"/>
-              <w:right w:val="single" w:sz="4" w:color="BFBFBF"/>
+              <w:top w:val="single" w:sz="4" w:color="808080"/>
+              <w:bottom w:val="single" w:sz="4" w:color="808080"/>
+              <w:left w:val="single" w:sz="4" w:color="808080"/>
+              <w:right w:val="single" w:sz="4" w:color="808080"/>
             </w:tcBorders>
-            <w:shd w:fill="F7F7F7"/>
+            <w:shd w:fill="FFFFFF"/>
           </w:tcPr>
           <w:p>
             <w:pPr>
@@ -6804,12 +6765,12 @@
               <w:end w:w="60" w:type="dxa"/>
             </w:tcMar>
             <w:tcBorders>
-              <w:top w:val="single" w:sz="4" w:color="BFBFBF"/>
-              <w:bottom w:val="single" w:sz="4" w:color="BFBFBF"/>
-              <w:left w:val="single" w:sz="4" w:color="BFBFBF"/>
-              <w:right w:val="single" w:sz="4" w:color="BFBFBF"/>
+              <w:top w:val="single" w:sz="4" w:color="808080"/>
+              <w:bottom w:val="single" w:sz="4" w:color="808080"/>
+              <w:left w:val="single" w:sz="4" w:color="808080"/>
+              <w:right w:val="single" w:sz="4" w:color="808080"/>
             </w:tcBorders>
-            <w:shd w:fill="F7F7F7"/>
+            <w:shd w:fill="FFFFFF"/>
           </w:tcPr>
           <w:p>
             <w:pPr>
@@ -6964,9 +6925,6 @@
         <w:gridCol w:w="5556"/>
       </w:tblGrid>
       <w:tr>
-        <w:trPr>
-          <w:cantSplit/>
-        </w:trPr>
         <w:tc>
           <w:tcPr>
             <w:tcW w:type="dxa" w:w="5556"/>
@@ -6977,12 +6935,12 @@
               <w:end w:w="60" w:type="dxa"/>
             </w:tcMar>
             <w:tcBorders>
-              <w:top w:val="single" w:sz="4" w:color="BFBFBF"/>
-              <w:bottom w:val="single" w:sz="4" w:color="BFBFBF"/>
-              <w:left w:val="single" w:sz="4" w:color="BFBFBF"/>
-              <w:right w:val="single" w:sz="4" w:color="BFBFBF"/>
+              <w:top w:val="single" w:sz="4" w:color="808080"/>
+              <w:bottom w:val="single" w:sz="4" w:color="808080"/>
+              <w:left w:val="single" w:sz="4" w:color="808080"/>
+              <w:right w:val="single" w:sz="4" w:color="808080"/>
             </w:tcBorders>
-            <w:shd w:fill="F7F7F7"/>
+            <w:shd w:fill="FFFFFF"/>
           </w:tcPr>
           <w:p>
             <w:pPr>
@@ -7087,12 +7045,12 @@
               <w:end w:w="60" w:type="dxa"/>
             </w:tcMar>
             <w:tcBorders>
-              <w:top w:val="single" w:sz="4" w:color="BFBFBF"/>
-              <w:bottom w:val="single" w:sz="4" w:color="BFBFBF"/>
-              <w:left w:val="single" w:sz="4" w:color="BFBFBF"/>
-              <w:right w:val="single" w:sz="4" w:color="BFBFBF"/>
+              <w:top w:val="single" w:sz="4" w:color="808080"/>
+              <w:bottom w:val="single" w:sz="4" w:color="808080"/>
+              <w:left w:val="single" w:sz="4" w:color="808080"/>
+              <w:right w:val="single" w:sz="4" w:color="808080"/>
             </w:tcBorders>
-            <w:shd w:fill="F7F7F7"/>
+            <w:shd w:fill="FFFFFF"/>
           </w:tcPr>
           <w:p>
             <w:pPr>
@@ -7201,9 +7159,6 @@
         <w:gridCol w:w="5556"/>
       </w:tblGrid>
       <w:tr>
-        <w:trPr>
-          <w:cantSplit/>
-        </w:trPr>
         <w:tc>
           <w:tcPr>
             <w:tcW w:type="dxa" w:w="5556"/>
@@ -7214,12 +7169,12 @@
               <w:end w:w="60" w:type="dxa"/>
             </w:tcMar>
             <w:tcBorders>
-              <w:top w:val="single" w:sz="4" w:color="A6A6A6"/>
-              <w:bottom w:val="single" w:sz="4" w:color="A6A6A6"/>
-              <w:left w:val="single" w:sz="4" w:color="A6A6A6"/>
-              <w:right w:val="single" w:sz="4" w:color="A6A6A6"/>
+              <w:top w:val="single" w:sz="4" w:color="808080"/>
+              <w:bottom w:val="single" w:sz="4" w:color="808080"/>
+              <w:left w:val="single" w:sz="4" w:color="808080"/>
+              <w:right w:val="single" w:sz="4" w:color="808080"/>
             </w:tcBorders>
-            <w:shd w:fill="FCE4D6"/>
+            <w:shd w:fill="E3E3E3"/>
           </w:tcPr>
           <w:p>
             <w:pPr>
@@ -7272,12 +7227,12 @@
               <w:end w:w="60" w:type="dxa"/>
             </w:tcMar>
             <w:tcBorders>
-              <w:top w:val="single" w:sz="4" w:color="A6A6A6"/>
-              <w:bottom w:val="single" w:sz="4" w:color="A6A6A6"/>
-              <w:left w:val="single" w:sz="4" w:color="A6A6A6"/>
-              <w:right w:val="single" w:sz="4" w:color="A6A6A6"/>
+              <w:top w:val="single" w:sz="4" w:color="808080"/>
+              <w:bottom w:val="single" w:sz="4" w:color="808080"/>
+              <w:left w:val="single" w:sz="4" w:color="808080"/>
+              <w:right w:val="single" w:sz="4" w:color="808080"/>
             </w:tcBorders>
-            <w:shd w:fill="FCE4D6"/>
+            <w:shd w:fill="E3E3E3"/>
           </w:tcPr>
           <w:p>
             <w:pPr>
@@ -7334,9 +7289,6 @@
         <w:gridCol w:w="5556"/>
       </w:tblGrid>
       <w:tr>
-        <w:trPr>
-          <w:cantSplit/>
-        </w:trPr>
         <w:tc>
           <w:tcPr>
             <w:tcW w:type="dxa" w:w="5556"/>
@@ -7347,10 +7299,10 @@
               <w:end w:w="60" w:type="dxa"/>
             </w:tcMar>
             <w:tcBorders>
-              <w:top w:val="single" w:sz="4" w:color="BFBFBF"/>
-              <w:bottom w:val="single" w:sz="4" w:color="BFBFBF"/>
-              <w:left w:val="single" w:sz="4" w:color="BFBFBF"/>
-              <w:right w:val="single" w:sz="4" w:color="BFBFBF"/>
+              <w:top w:val="single" w:sz="4" w:color="808080"/>
+              <w:bottom w:val="single" w:sz="4" w:color="808080"/>
+              <w:left w:val="single" w:sz="4" w:color="808080"/>
+              <w:right w:val="single" w:sz="4" w:color="808080"/>
             </w:tcBorders>
             <w:shd w:fill="F2F2F2"/>
           </w:tcPr>
@@ -7444,10 +7396,10 @@
               <w:end w:w="60" w:type="dxa"/>
             </w:tcMar>
             <w:tcBorders>
-              <w:top w:val="single" w:sz="4" w:color="BFBFBF"/>
-              <w:bottom w:val="single" w:sz="4" w:color="BFBFBF"/>
-              <w:left w:val="single" w:sz="4" w:color="BFBFBF"/>
-              <w:right w:val="single" w:sz="4" w:color="BFBFBF"/>
+              <w:top w:val="single" w:sz="4" w:color="808080"/>
+              <w:bottom w:val="single" w:sz="4" w:color="808080"/>
+              <w:left w:val="single" w:sz="4" w:color="808080"/>
+              <w:right w:val="single" w:sz="4" w:color="808080"/>
             </w:tcBorders>
             <w:shd w:fill="F2F2F2"/>
           </w:tcPr>
@@ -7518,9 +7470,6 @@
         <w:gridCol w:w="11113"/>
       </w:tblGrid>
       <w:tr>
-        <w:trPr>
-          <w:cantSplit/>
-        </w:trPr>
         <w:tc>
           <w:tcPr>
             <w:tcW w:type="dxa" w:w="11113"/>
@@ -7531,12 +7480,12 @@
               <w:end w:w="60" w:type="dxa"/>
             </w:tcMar>
             <w:tcBorders>
-              <w:top w:val="single" w:sz="6" w:color="70AD47"/>
-              <w:bottom w:val="single" w:sz="6" w:color="70AD47"/>
-              <w:left w:val="single" w:sz="6" w:color="70AD47"/>
-              <w:right w:val="single" w:sz="6" w:color="70AD47"/>
+              <w:top w:val="single" w:sz="6" w:color="000000"/>
+              <w:bottom w:val="single" w:sz="6" w:color="000000"/>
+              <w:left w:val="single" w:sz="6" w:color="000000"/>
+              <w:right w:val="single" w:sz="6" w:color="000000"/>
             </w:tcBorders>
-            <w:shd w:fill="E2F0D9"/>
+            <w:shd w:fill="D0D0D0"/>
           </w:tcPr>
           <w:p>
             <w:pPr>
@@ -7609,9 +7558,6 @@
         <w:gridCol w:w="11113"/>
       </w:tblGrid>
       <w:tr>
-        <w:trPr>
-          <w:cantSplit/>
-        </w:trPr>
         <w:tc>
           <w:tcPr>
             <w:tcW w:type="dxa" w:w="11113"/>
@@ -7622,12 +7568,12 @@
               <w:end w:w="60" w:type="dxa"/>
             </w:tcMar>
             <w:tcBorders>
-              <w:top w:val="single" w:sz="4" w:color="BFBFBF"/>
-              <w:bottom w:val="single" w:sz="4" w:color="BFBFBF"/>
-              <w:left w:val="single" w:sz="4" w:color="BFBFBF"/>
-              <w:right w:val="single" w:sz="4" w:color="BFBFBF"/>
+              <w:top w:val="single" w:sz="4" w:color="808080"/>
+              <w:bottom w:val="single" w:sz="4" w:color="808080"/>
+              <w:left w:val="single" w:sz="4" w:color="808080"/>
+              <w:right w:val="single" w:sz="4" w:color="808080"/>
             </w:tcBorders>
-            <w:shd w:fill="EAF2F8"/>
+            <w:shd w:fill="F2F2F2"/>
           </w:tcPr>
           <w:p>
             <w:pPr>
@@ -7684,9 +7630,6 @@
         <w:gridCol w:w="5556"/>
       </w:tblGrid>
       <w:tr>
-        <w:trPr>
-          <w:cantSplit/>
-        </w:trPr>
         <w:tc>
           <w:tcPr>
             <w:tcW w:type="dxa" w:w="5556"/>
@@ -7697,12 +7640,12 @@
               <w:end w:w="60" w:type="dxa"/>
             </w:tcMar>
             <w:tcBorders>
-              <w:top w:val="single" w:sz="4" w:color="BFBFBF"/>
-              <w:bottom w:val="single" w:sz="4" w:color="BFBFBF"/>
-              <w:left w:val="single" w:sz="4" w:color="BFBFBF"/>
-              <w:right w:val="single" w:sz="4" w:color="BFBFBF"/>
+              <w:top w:val="single" w:sz="4" w:color="808080"/>
+              <w:bottom w:val="single" w:sz="4" w:color="808080"/>
+              <w:left w:val="single" w:sz="4" w:color="808080"/>
+              <w:right w:val="single" w:sz="4" w:color="808080"/>
             </w:tcBorders>
-            <w:shd w:fill="F7F7F7"/>
+            <w:shd w:fill="FFFFFF"/>
           </w:tcPr>
           <w:p>
             <w:pPr>
@@ -7823,12 +7766,12 @@
               <w:end w:w="60" w:type="dxa"/>
             </w:tcMar>
             <w:tcBorders>
-              <w:top w:val="single" w:sz="4" w:color="BFBFBF"/>
-              <w:bottom w:val="single" w:sz="4" w:color="BFBFBF"/>
-              <w:left w:val="single" w:sz="4" w:color="BFBFBF"/>
-              <w:right w:val="single" w:sz="4" w:color="BFBFBF"/>
+              <w:top w:val="single" w:sz="4" w:color="808080"/>
+              <w:bottom w:val="single" w:sz="4" w:color="808080"/>
+              <w:left w:val="single" w:sz="4" w:color="808080"/>
+              <w:right w:val="single" w:sz="4" w:color="808080"/>
             </w:tcBorders>
-            <w:shd w:fill="F7F7F7"/>
+            <w:shd w:fill="FFFFFF"/>
           </w:tcPr>
           <w:p>
             <w:pPr>
@@ -8012,9 +7955,6 @@
         <w:gridCol w:w="3685"/>
       </w:tblGrid>
       <w:tr>
-        <w:trPr>
-          <w:cantSplit/>
-        </w:trPr>
         <w:tc>
           <w:tcPr>
             <w:tcW w:type="dxa" w:w="3713"/>
@@ -8025,12 +7965,12 @@
               <w:end w:w="60" w:type="dxa"/>
             </w:tcMar>
             <w:tcBorders>
-              <w:top w:val="single" w:sz="6" w:color="70AD47"/>
-              <w:bottom w:val="single" w:sz="6" w:color="70AD47"/>
-              <w:left w:val="single" w:sz="6" w:color="70AD47"/>
-              <w:right w:val="single" w:sz="6" w:color="70AD47"/>
+              <w:top w:val="single" w:sz="6" w:color="000000"/>
+              <w:bottom w:val="single" w:sz="6" w:color="000000"/>
+              <w:left w:val="single" w:sz="6" w:color="000000"/>
+              <w:right w:val="single" w:sz="6" w:color="000000"/>
             </w:tcBorders>
-            <w:shd w:fill="E2F0D9"/>
+            <w:shd w:fill="D0D0D0"/>
           </w:tcPr>
           <w:p>
             <w:pPr>
@@ -8112,12 +8052,12 @@
               <w:end w:w="60" w:type="dxa"/>
             </w:tcMar>
             <w:tcBorders>
-              <w:top w:val="single" w:sz="6" w:color="A6A6A6"/>
-              <w:bottom w:val="single" w:sz="6" w:color="A6A6A6"/>
-              <w:left w:val="single" w:sz="6" w:color="A6A6A6"/>
-              <w:right w:val="single" w:sz="6" w:color="A6A6A6"/>
+              <w:top w:val="single" w:sz="6" w:color="808080"/>
+              <w:bottom w:val="single" w:sz="6" w:color="808080"/>
+              <w:left w:val="single" w:sz="6" w:color="808080"/>
+              <w:right w:val="single" w:sz="6" w:color="808080"/>
             </w:tcBorders>
-            <w:shd w:fill="FFF2CC"/>
+            <w:shd w:fill="E3E3E3"/>
           </w:tcPr>
           <w:p>
             <w:pPr>
@@ -8170,12 +8110,12 @@
               <w:end w:w="60" w:type="dxa"/>
             </w:tcMar>
             <w:tcBorders>
-              <w:top w:val="single" w:sz="6" w:color="A6A6A6"/>
-              <w:bottom w:val="single" w:sz="6" w:color="A6A6A6"/>
-              <w:left w:val="single" w:sz="6" w:color="A6A6A6"/>
-              <w:right w:val="single" w:sz="6" w:color="A6A6A6"/>
+              <w:top w:val="single" w:sz="6" w:color="808080"/>
+              <w:bottom w:val="single" w:sz="6" w:color="808080"/>
+              <w:left w:val="single" w:sz="6" w:color="808080"/>
+              <w:right w:val="single" w:sz="6" w:color="808080"/>
             </w:tcBorders>
-            <w:shd w:fill="FCE4D6"/>
+            <w:shd w:fill="E3E3E3"/>
           </w:tcPr>
           <w:p>
             <w:pPr>
@@ -8258,9 +8198,6 @@
         <w:gridCol w:w="5556"/>
       </w:tblGrid>
       <w:tr>
-        <w:trPr>
-          <w:cantSplit/>
-        </w:trPr>
         <w:tc>
           <w:tcPr>
             <w:tcW w:type="dxa" w:w="5556"/>
@@ -8271,10 +8208,10 @@
               <w:end w:w="60" w:type="dxa"/>
             </w:tcMar>
             <w:tcBorders>
-              <w:top w:val="single" w:sz="4" w:color="BFBFBF"/>
-              <w:bottom w:val="single" w:sz="4" w:color="BFBFBF"/>
-              <w:left w:val="single" w:sz="4" w:color="BFBFBF"/>
-              <w:right w:val="single" w:sz="4" w:color="BFBFBF"/>
+              <w:top w:val="single" w:sz="4" w:color="808080"/>
+              <w:bottom w:val="single" w:sz="4" w:color="808080"/>
+              <w:left w:val="single" w:sz="4" w:color="808080"/>
+              <w:right w:val="single" w:sz="4" w:color="808080"/>
             </w:tcBorders>
             <w:shd w:fill="F2F2F2"/>
           </w:tcPr>
@@ -8381,10 +8318,10 @@
               <w:end w:w="60" w:type="dxa"/>
             </w:tcMar>
             <w:tcBorders>
-              <w:top w:val="single" w:sz="4" w:color="BFBFBF"/>
-              <w:bottom w:val="single" w:sz="4" w:color="BFBFBF"/>
-              <w:left w:val="single" w:sz="4" w:color="BFBFBF"/>
-              <w:right w:val="single" w:sz="4" w:color="BFBFBF"/>
+              <w:top w:val="single" w:sz="4" w:color="808080"/>
+              <w:bottom w:val="single" w:sz="4" w:color="808080"/>
+              <w:left w:val="single" w:sz="4" w:color="808080"/>
+              <w:right w:val="single" w:sz="4" w:color="808080"/>
             </w:tcBorders>
             <w:shd w:fill="F2F2F2"/>
           </w:tcPr>
@@ -8513,9 +8450,6 @@
         <w:gridCol w:w="3685"/>
       </w:tblGrid>
       <w:tr>
-        <w:trPr>
-          <w:cantSplit/>
-        </w:trPr>
         <w:tc>
           <w:tcPr>
             <w:tcW w:type="dxa" w:w="3713"/>
@@ -8526,12 +8460,12 @@
               <w:end w:w="60" w:type="dxa"/>
             </w:tcMar>
             <w:tcBorders>
-              <w:top w:val="single" w:sz="4" w:color="BFBFBF"/>
-              <w:bottom w:val="single" w:sz="4" w:color="BFBFBF"/>
-              <w:left w:val="single" w:sz="4" w:color="BFBFBF"/>
-              <w:right w:val="single" w:sz="4" w:color="BFBFBF"/>
+              <w:top w:val="single" w:sz="4" w:color="808080"/>
+              <w:bottom w:val="single" w:sz="4" w:color="808080"/>
+              <w:left w:val="single" w:sz="4" w:color="808080"/>
+              <w:right w:val="single" w:sz="4" w:color="808080"/>
             </w:tcBorders>
-            <w:shd w:fill="F7F7F7"/>
+            <w:shd w:fill="FFFFFF"/>
           </w:tcPr>
           <w:p>
             <w:pPr>
@@ -8621,12 +8555,12 @@
               <w:end w:w="60" w:type="dxa"/>
             </w:tcMar>
             <w:tcBorders>
-              <w:top w:val="single" w:sz="4" w:color="BFBFBF"/>
-              <w:bottom w:val="single" w:sz="4" w:color="BFBFBF"/>
-              <w:left w:val="single" w:sz="4" w:color="BFBFBF"/>
-              <w:right w:val="single" w:sz="4" w:color="BFBFBF"/>
+              <w:top w:val="single" w:sz="4" w:color="808080"/>
+              <w:bottom w:val="single" w:sz="4" w:color="808080"/>
+              <w:left w:val="single" w:sz="4" w:color="808080"/>
+              <w:right w:val="single" w:sz="4" w:color="808080"/>
             </w:tcBorders>
-            <w:shd w:fill="F7F7F7"/>
+            <w:shd w:fill="FFFFFF"/>
           </w:tcPr>
           <w:p>
             <w:pPr>
@@ -8708,12 +8642,12 @@
               <w:end w:w="60" w:type="dxa"/>
             </w:tcMar>
             <w:tcBorders>
-              <w:top w:val="single" w:sz="4" w:color="BFBFBF"/>
-              <w:bottom w:val="single" w:sz="4" w:color="BFBFBF"/>
-              <w:left w:val="single" w:sz="4" w:color="BFBFBF"/>
-              <w:right w:val="single" w:sz="4" w:color="BFBFBF"/>
+              <w:top w:val="single" w:sz="4" w:color="808080"/>
+              <w:bottom w:val="single" w:sz="4" w:color="808080"/>
+              <w:left w:val="single" w:sz="4" w:color="808080"/>
+              <w:right w:val="single" w:sz="4" w:color="808080"/>
             </w:tcBorders>
-            <w:shd w:fill="F7F7F7"/>
+            <w:shd w:fill="FFFFFF"/>
           </w:tcPr>
           <w:p>
             <w:pPr>
@@ -8757,9 +8691,6 @@
         <w:gridCol w:w="4113"/>
       </w:tblGrid>
       <w:tr>
-        <w:trPr>
-          <w:cantSplit/>
-        </w:trPr>
         <w:tc>
           <w:tcPr>
             <w:tcW w:type="dxa" w:w="7000"/>
@@ -8770,12 +8701,12 @@
               <w:end w:w="60" w:type="dxa"/>
             </w:tcMar>
             <w:tcBorders>
-              <w:top w:val="single" w:sz="6" w:color="70AD47"/>
-              <w:bottom w:val="single" w:sz="6" w:color="70AD47"/>
-              <w:left w:val="single" w:sz="6" w:color="70AD47"/>
-              <w:right w:val="single" w:sz="6" w:color="70AD47"/>
+              <w:top w:val="single" w:sz="6" w:color="000000"/>
+              <w:bottom w:val="single" w:sz="6" w:color="000000"/>
+              <w:left w:val="single" w:sz="6" w:color="000000"/>
+              <w:right w:val="single" w:sz="6" w:color="000000"/>
             </w:tcBorders>
-            <w:shd w:fill="E2F0D9"/>
+            <w:shd w:fill="D0D0D0"/>
           </w:tcPr>
           <w:p>
             <w:pPr>
@@ -8815,12 +8746,12 @@
               <w:end w:w="60" w:type="dxa"/>
             </w:tcMar>
             <w:tcBorders>
-              <w:top w:val="single" w:sz="6" w:color="A6A6A6"/>
-              <w:bottom w:val="single" w:sz="6" w:color="A6A6A6"/>
-              <w:left w:val="single" w:sz="6" w:color="A6A6A6"/>
-              <w:right w:val="single" w:sz="6" w:color="A6A6A6"/>
+              <w:top w:val="single" w:sz="6" w:color="808080"/>
+              <w:bottom w:val="single" w:sz="6" w:color="808080"/>
+              <w:left w:val="single" w:sz="6" w:color="808080"/>
+              <w:right w:val="single" w:sz="6" w:color="808080"/>
             </w:tcBorders>
-            <w:shd w:fill="FFF2CC"/>
+            <w:shd w:fill="E3E3E3"/>
           </w:tcPr>
           <w:p>
             <w:pPr>
@@ -8958,9 +8889,6 @@
         <w:gridCol w:w="11113"/>
       </w:tblGrid>
       <w:tr>
-        <w:trPr>
-          <w:cantSplit/>
-        </w:trPr>
         <w:tc>
           <w:tcPr>
             <w:tcW w:type="dxa" w:w="11113"/>
@@ -8971,12 +8899,12 @@
               <w:end w:w="60" w:type="dxa"/>
             </w:tcMar>
             <w:tcBorders>
-              <w:top w:val="single" w:sz="4" w:color="BFBFBF"/>
-              <w:bottom w:val="single" w:sz="4" w:color="BFBFBF"/>
-              <w:left w:val="single" w:sz="4" w:color="BFBFBF"/>
-              <w:right w:val="single" w:sz="4" w:color="BFBFBF"/>
+              <w:top w:val="single" w:sz="4" w:color="808080"/>
+              <w:bottom w:val="single" w:sz="4" w:color="808080"/>
+              <w:left w:val="single" w:sz="4" w:color="808080"/>
+              <w:right w:val="single" w:sz="4" w:color="808080"/>
             </w:tcBorders>
-            <w:shd w:fill="EAF2F8"/>
+            <w:shd w:fill="F2F2F2"/>
           </w:tcPr>
           <w:p>
             <w:pPr>
@@ -9020,9 +8948,6 @@
         <w:gridCol w:w="5556"/>
       </w:tblGrid>
       <w:tr>
-        <w:trPr>
-          <w:cantSplit/>
-        </w:trPr>
         <w:tc>
           <w:tcPr>
             <w:tcW w:type="dxa" w:w="5556"/>
@@ -9033,12 +8958,12 @@
               <w:end w:w="60" w:type="dxa"/>
             </w:tcMar>
             <w:tcBorders>
-              <w:top w:val="single" w:sz="4" w:color="BFBFBF"/>
-              <w:bottom w:val="single" w:sz="4" w:color="BFBFBF"/>
-              <w:left w:val="single" w:sz="4" w:color="BFBFBF"/>
-              <w:right w:val="single" w:sz="4" w:color="BFBFBF"/>
+              <w:top w:val="single" w:sz="4" w:color="808080"/>
+              <w:bottom w:val="single" w:sz="4" w:color="808080"/>
+              <w:left w:val="single" w:sz="4" w:color="808080"/>
+              <w:right w:val="single" w:sz="4" w:color="808080"/>
             </w:tcBorders>
-            <w:shd w:fill="F7F7F7"/>
+            <w:shd w:fill="FFFFFF"/>
           </w:tcPr>
           <w:p>
             <w:pPr>
@@ -9260,12 +9185,12 @@
               <w:end w:w="60" w:type="dxa"/>
             </w:tcMar>
             <w:tcBorders>
-              <w:top w:val="single" w:sz="4" w:color="A6A6A6"/>
-              <w:bottom w:val="single" w:sz="4" w:color="A6A6A6"/>
-              <w:left w:val="single" w:sz="4" w:color="A6A6A6"/>
-              <w:right w:val="single" w:sz="4" w:color="A6A6A6"/>
+              <w:top w:val="single" w:sz="4" w:color="808080"/>
+              <w:bottom w:val="single" w:sz="4" w:color="808080"/>
+              <w:left w:val="single" w:sz="4" w:color="808080"/>
+              <w:right w:val="single" w:sz="4" w:color="808080"/>
             </w:tcBorders>
-            <w:shd w:fill="FCE4D6"/>
+            <w:shd w:fill="E3E3E3"/>
           </w:tcPr>
           <w:p>
             <w:pPr>
@@ -9410,9 +9335,6 @@
         <w:gridCol w:w="3685"/>
       </w:tblGrid>
       <w:tr>
-        <w:trPr>
-          <w:cantSplit/>
-        </w:trPr>
         <w:tc>
           <w:tcPr>
             <w:tcW w:type="dxa" w:w="3713"/>
@@ -9423,10 +9345,10 @@
               <w:end w:w="60" w:type="dxa"/>
             </w:tcMar>
             <w:tcBorders>
-              <w:top w:val="single" w:sz="4" w:color="BFBFBF"/>
-              <w:bottom w:val="single" w:sz="4" w:color="BFBFBF"/>
-              <w:left w:val="single" w:sz="4" w:color="BFBFBF"/>
-              <w:right w:val="single" w:sz="4" w:color="BFBFBF"/>
+              <w:top w:val="single" w:sz="4" w:color="808080"/>
+              <w:bottom w:val="single" w:sz="4" w:color="808080"/>
+              <w:left w:val="single" w:sz="4" w:color="808080"/>
+              <w:right w:val="single" w:sz="4" w:color="808080"/>
             </w:tcBorders>
             <w:shd w:fill="F2F2F2"/>
           </w:tcPr>
@@ -9489,12 +9411,12 @@
               <w:end w:w="60" w:type="dxa"/>
             </w:tcMar>
             <w:tcBorders>
-              <w:top w:val="single" w:sz="4" w:color="BFBFBF"/>
-              <w:bottom w:val="single" w:sz="4" w:color="BFBFBF"/>
-              <w:left w:val="single" w:sz="4" w:color="BFBFBF"/>
-              <w:right w:val="single" w:sz="4" w:color="BFBFBF"/>
+              <w:top w:val="single" w:sz="4" w:color="808080"/>
+              <w:bottom w:val="single" w:sz="4" w:color="808080"/>
+              <w:left w:val="single" w:sz="4" w:color="808080"/>
+              <w:right w:val="single" w:sz="4" w:color="808080"/>
             </w:tcBorders>
-            <w:shd w:fill="FFF2CC"/>
+            <w:shd w:fill="E3E3E3"/>
           </w:tcPr>
           <w:p>
             <w:pPr>
@@ -9560,10 +9482,10 @@
               <w:end w:w="60" w:type="dxa"/>
             </w:tcMar>
             <w:tcBorders>
-              <w:top w:val="single" w:sz="4" w:color="BFBFBF"/>
-              <w:bottom w:val="single" w:sz="4" w:color="BFBFBF"/>
-              <w:left w:val="single" w:sz="4" w:color="BFBFBF"/>
-              <w:right w:val="single" w:sz="4" w:color="BFBFBF"/>
+              <w:top w:val="single" w:sz="4" w:color="808080"/>
+              <w:bottom w:val="single" w:sz="4" w:color="808080"/>
+              <w:left w:val="single" w:sz="4" w:color="808080"/>
+              <w:right w:val="single" w:sz="4" w:color="808080"/>
             </w:tcBorders>
             <w:shd w:fill="F2F2F2"/>
           </w:tcPr>
@@ -9650,9 +9572,6 @@
         <w:gridCol w:w="11113"/>
       </w:tblGrid>
       <w:tr>
-        <w:trPr>
-          <w:cantSplit/>
-        </w:trPr>
         <w:tc>
           <w:tcPr>
             <w:tcW w:type="dxa" w:w="11113"/>
@@ -9663,12 +9582,12 @@
               <w:end w:w="60" w:type="dxa"/>
             </w:tcMar>
             <w:tcBorders>
-              <w:top w:val="single" w:sz="4" w:color="BFBFBF"/>
-              <w:bottom w:val="single" w:sz="4" w:color="BFBFBF"/>
-              <w:left w:val="single" w:sz="4" w:color="BFBFBF"/>
-              <w:right w:val="single" w:sz="4" w:color="BFBFBF"/>
+              <w:top w:val="single" w:sz="4" w:color="808080"/>
+              <w:bottom w:val="single" w:sz="4" w:color="808080"/>
+              <w:left w:val="single" w:sz="4" w:color="808080"/>
+              <w:right w:val="single" w:sz="4" w:color="808080"/>
             </w:tcBorders>
-            <w:shd w:fill="F7F7F7"/>
+            <w:shd w:fill="FFFFFF"/>
           </w:tcPr>
           <w:p>
             <w:pPr>
@@ -9712,9 +9631,6 @@
         <w:gridCol w:w="4113"/>
       </w:tblGrid>
       <w:tr>
-        <w:trPr>
-          <w:cantSplit/>
-        </w:trPr>
         <w:tc>
           <w:tcPr>
             <w:tcW w:type="dxa" w:w="7000"/>
@@ -9725,12 +9641,12 @@
               <w:end w:w="60" w:type="dxa"/>
             </w:tcMar>
             <w:tcBorders>
-              <w:top w:val="single" w:sz="6" w:color="70AD47"/>
-              <w:bottom w:val="single" w:sz="6" w:color="70AD47"/>
-              <w:left w:val="single" w:sz="6" w:color="70AD47"/>
-              <w:right w:val="single" w:sz="6" w:color="70AD47"/>
+              <w:top w:val="single" w:sz="6" w:color="000000"/>
+              <w:bottom w:val="single" w:sz="6" w:color="000000"/>
+              <w:left w:val="single" w:sz="6" w:color="000000"/>
+              <w:right w:val="single" w:sz="6" w:color="000000"/>
             </w:tcBorders>
-            <w:shd w:fill="E2F0D9"/>
+            <w:shd w:fill="D0D0D0"/>
           </w:tcPr>
           <w:p>
             <w:pPr>
@@ -9770,12 +9686,12 @@
               <w:end w:w="60" w:type="dxa"/>
             </w:tcMar>
             <w:tcBorders>
-              <w:top w:val="single" w:sz="6" w:color="A6A6A6"/>
-              <w:bottom w:val="single" w:sz="6" w:color="A6A6A6"/>
-              <w:left w:val="single" w:sz="6" w:color="A6A6A6"/>
-              <w:right w:val="single" w:sz="6" w:color="A6A6A6"/>
+              <w:top w:val="single" w:sz="6" w:color="808080"/>
+              <w:bottom w:val="single" w:sz="6" w:color="808080"/>
+              <w:left w:val="single" w:sz="6" w:color="808080"/>
+              <w:right w:val="single" w:sz="6" w:color="808080"/>
             </w:tcBorders>
-            <w:shd w:fill="FFF2CC"/>
+            <w:shd w:fill="E3E3E3"/>
           </w:tcPr>
           <w:p>
             <w:pPr>
@@ -9913,9 +9829,6 @@
         <w:gridCol w:w="11113"/>
       </w:tblGrid>
       <w:tr>
-        <w:trPr>
-          <w:cantSplit/>
-        </w:trPr>
         <w:tc>
           <w:tcPr>
             <w:tcW w:type="dxa" w:w="11113"/>
@@ -9926,12 +9839,12 @@
               <w:end w:w="60" w:type="dxa"/>
             </w:tcMar>
             <w:tcBorders>
-              <w:top w:val="single" w:sz="4" w:color="BFBFBF"/>
-              <w:bottom w:val="single" w:sz="4" w:color="BFBFBF"/>
-              <w:left w:val="single" w:sz="4" w:color="BFBFBF"/>
-              <w:right w:val="single" w:sz="4" w:color="BFBFBF"/>
+              <w:top w:val="single" w:sz="4" w:color="808080"/>
+              <w:bottom w:val="single" w:sz="4" w:color="808080"/>
+              <w:left w:val="single" w:sz="4" w:color="808080"/>
+              <w:right w:val="single" w:sz="4" w:color="808080"/>
             </w:tcBorders>
-            <w:shd w:fill="EAF2F8"/>
+            <w:shd w:fill="F2F2F2"/>
           </w:tcPr>
           <w:p>
             <w:pPr>
@@ -9976,9 +9889,6 @@
         <w:gridCol w:w="3685"/>
       </w:tblGrid>
       <w:tr>
-        <w:trPr>
-          <w:cantSplit/>
-        </w:trPr>
         <w:tc>
           <w:tcPr>
             <w:tcW w:type="dxa" w:w="3713"/>
@@ -9989,12 +9899,12 @@
               <w:end w:w="60" w:type="dxa"/>
             </w:tcMar>
             <w:tcBorders>
-              <w:top w:val="single" w:sz="4" w:color="BFBFBF"/>
-              <w:bottom w:val="single" w:sz="4" w:color="BFBFBF"/>
-              <w:left w:val="single" w:sz="4" w:color="BFBFBF"/>
-              <w:right w:val="single" w:sz="4" w:color="BFBFBF"/>
+              <w:top w:val="single" w:sz="4" w:color="808080"/>
+              <w:bottom w:val="single" w:sz="4" w:color="808080"/>
+              <w:left w:val="single" w:sz="4" w:color="808080"/>
+              <w:right w:val="single" w:sz="4" w:color="808080"/>
             </w:tcBorders>
-            <w:shd w:fill="F7F7F7"/>
+            <w:shd w:fill="FFFFFF"/>
           </w:tcPr>
           <w:p>
             <w:pPr>
@@ -10095,12 +10005,12 @@
               <w:end w:w="60" w:type="dxa"/>
             </w:tcMar>
             <w:tcBorders>
-              <w:top w:val="single" w:sz="4" w:color="BFBFBF"/>
-              <w:bottom w:val="single" w:sz="4" w:color="BFBFBF"/>
-              <w:left w:val="single" w:sz="4" w:color="BFBFBF"/>
-              <w:right w:val="single" w:sz="4" w:color="BFBFBF"/>
+              <w:top w:val="single" w:sz="4" w:color="808080"/>
+              <w:bottom w:val="single" w:sz="4" w:color="808080"/>
+              <w:left w:val="single" w:sz="4" w:color="808080"/>
+              <w:right w:val="single" w:sz="4" w:color="808080"/>
             </w:tcBorders>
-            <w:shd w:fill="F7F7F7"/>
+            <w:shd w:fill="FFFFFF"/>
           </w:tcPr>
           <w:p>
             <w:pPr>
@@ -10201,12 +10111,12 @@
               <w:end w:w="60" w:type="dxa"/>
             </w:tcMar>
             <w:tcBorders>
-              <w:top w:val="single" w:sz="4" w:color="BFBFBF"/>
-              <w:bottom w:val="single" w:sz="4" w:color="BFBFBF"/>
-              <w:left w:val="single" w:sz="4" w:color="BFBFBF"/>
-              <w:right w:val="single" w:sz="4" w:color="BFBFBF"/>
+              <w:top w:val="single" w:sz="4" w:color="808080"/>
+              <w:bottom w:val="single" w:sz="4" w:color="808080"/>
+              <w:left w:val="single" w:sz="4" w:color="808080"/>
+              <w:right w:val="single" w:sz="4" w:color="808080"/>
             </w:tcBorders>
-            <w:shd w:fill="F7F7F7"/>
+            <w:shd w:fill="FFFFFF"/>
           </w:tcPr>
           <w:p>
             <w:pPr>
@@ -10311,9 +10221,6 @@
         <w:gridCol w:w="5556"/>
       </w:tblGrid>
       <w:tr>
-        <w:trPr>
-          <w:cantSplit/>
-        </w:trPr>
         <w:tc>
           <w:tcPr>
             <w:tcW w:type="dxa" w:w="5556"/>
@@ -10324,12 +10231,12 @@
               <w:end w:w="60" w:type="dxa"/>
             </w:tcMar>
             <w:tcBorders>
-              <w:top w:val="single" w:sz="4" w:color="A6A6A6"/>
-              <w:bottom w:val="single" w:sz="4" w:color="A6A6A6"/>
-              <w:left w:val="single" w:sz="4" w:color="A6A6A6"/>
-              <w:right w:val="single" w:sz="4" w:color="A6A6A6"/>
+              <w:top w:val="single" w:sz="4" w:color="808080"/>
+              <w:bottom w:val="single" w:sz="4" w:color="808080"/>
+              <w:left w:val="single" w:sz="4" w:color="808080"/>
+              <w:right w:val="single" w:sz="4" w:color="808080"/>
             </w:tcBorders>
-            <w:shd w:fill="FCE4D6"/>
+            <w:shd w:fill="E3E3E3"/>
           </w:tcPr>
           <w:p>
             <w:pPr>
@@ -10408,10 +10315,10 @@
               <w:end w:w="60" w:type="dxa"/>
             </w:tcMar>
             <w:tcBorders>
-              <w:top w:val="single" w:sz="4" w:color="BFBFBF"/>
-              <w:bottom w:val="single" w:sz="4" w:color="BFBFBF"/>
-              <w:left w:val="single" w:sz="4" w:color="BFBFBF"/>
-              <w:right w:val="single" w:sz="4" w:color="BFBFBF"/>
+              <w:top w:val="single" w:sz="4" w:color="808080"/>
+              <w:bottom w:val="single" w:sz="4" w:color="808080"/>
+              <w:left w:val="single" w:sz="4" w:color="808080"/>
+              <w:right w:val="single" w:sz="4" w:color="808080"/>
             </w:tcBorders>
             <w:shd w:fill="F2F2F2"/>
           </w:tcPr>
@@ -10483,9 +10390,6 @@
         <w:gridCol w:w="11113"/>
       </w:tblGrid>
       <w:tr>
-        <w:trPr>
-          <w:cantSplit/>
-        </w:trPr>
         <w:tc>
           <w:tcPr>
             <w:tcW w:type="dxa" w:w="11113"/>
@@ -10496,12 +10400,12 @@
               <w:end w:w="60" w:type="dxa"/>
             </w:tcMar>
             <w:tcBorders>
-              <w:top w:val="single" w:sz="4" w:color="BFBFBF"/>
-              <w:bottom w:val="single" w:sz="4" w:color="BFBFBF"/>
-              <w:left w:val="single" w:sz="4" w:color="BFBFBF"/>
-              <w:right w:val="single" w:sz="4" w:color="BFBFBF"/>
+              <w:top w:val="single" w:sz="4" w:color="808080"/>
+              <w:bottom w:val="single" w:sz="4" w:color="808080"/>
+              <w:left w:val="single" w:sz="4" w:color="808080"/>
+              <w:right w:val="single" w:sz="4" w:color="808080"/>
             </w:tcBorders>
-            <w:shd w:fill="FFF2CC"/>
+            <w:shd w:fill="E3E3E3"/>
           </w:tcPr>
           <w:p>
             <w:pPr>
@@ -10574,9 +10478,6 @@
         <w:gridCol w:w="4113"/>
       </w:tblGrid>
       <w:tr>
-        <w:trPr>
-          <w:cantSplit/>
-        </w:trPr>
         <w:tc>
           <w:tcPr>
             <w:tcW w:type="dxa" w:w="7000"/>
@@ -10587,12 +10488,12 @@
               <w:end w:w="60" w:type="dxa"/>
             </w:tcMar>
             <w:tcBorders>
-              <w:top w:val="single" w:sz="6" w:color="70AD47"/>
-              <w:bottom w:val="single" w:sz="6" w:color="70AD47"/>
-              <w:left w:val="single" w:sz="6" w:color="70AD47"/>
-              <w:right w:val="single" w:sz="6" w:color="70AD47"/>
+              <w:top w:val="single" w:sz="6" w:color="000000"/>
+              <w:bottom w:val="single" w:sz="6" w:color="000000"/>
+              <w:left w:val="single" w:sz="6" w:color="000000"/>
+              <w:right w:val="single" w:sz="6" w:color="000000"/>
             </w:tcBorders>
-            <w:shd w:fill="E2F0D9"/>
+            <w:shd w:fill="D0D0D0"/>
           </w:tcPr>
           <w:p>
             <w:pPr>
@@ -10645,12 +10546,12 @@
               <w:end w:w="60" w:type="dxa"/>
             </w:tcMar>
             <w:tcBorders>
-              <w:top w:val="single" w:sz="6" w:color="A6A6A6"/>
-              <w:bottom w:val="single" w:sz="6" w:color="A6A6A6"/>
-              <w:left w:val="single" w:sz="6" w:color="A6A6A6"/>
-              <w:right w:val="single" w:sz="6" w:color="A6A6A6"/>
+              <w:top w:val="single" w:sz="6" w:color="808080"/>
+              <w:bottom w:val="single" w:sz="6" w:color="808080"/>
+              <w:left w:val="single" w:sz="6" w:color="808080"/>
+              <w:right w:val="single" w:sz="6" w:color="808080"/>
             </w:tcBorders>
-            <w:shd w:fill="FFF2CC"/>
+            <w:shd w:fill="E3E3E3"/>
           </w:tcPr>
           <w:p>
             <w:pPr>

</xml_diff>